<commit_message>
fix(report): match template body formatting on every paragraph
Inserted paragraphs were getting a blank pPr, so within each section the
first line (the reused [內文] placeholder) was indented + justified while
the rest were flush-left — a ragged, inconsistent layout. Now every
inserted body paragraph clones the template's body pPr (left indent +
justified), so all body text is uniform. Fonts were already correct
(標楷體 for CJK, Times New Roman for Latin/digits, 12pt).

Co-Authored-By: Claude Opus 4.8 (1M context) <noreply@anthropic.com>
</commit_message>
<xml_diff>
--- a/report/TEAM_10505_ESG永續承諾驗證競賽.docx
+++ b/report/TEAM_10505_ESG永續承諾驗證競賽.docx
@@ -468,6 +468,13 @@
     <w:p>
       <w:pPr>
         <w:spacing w:lineRule="auto" w:line="276" w:after="120"/>
+        <w:ind w:left="724" w:hanging="57"/>
+        <w:jc w:val="both"/>
+        <w:rPr>
+          <w:rFonts w:ascii="標楷體" w:eastAsia="標楷體" w:hAnsi="標楷體" w:cs="標楷體"/>
+          <w:sz w:val="24"/>
+          <w:szCs w:val="24"/>
+        </w:rPr>
       </w:pPr>
       <w:r>
         <w:rPr>
@@ -481,6 +488,13 @@
     <w:p>
       <w:pPr>
         <w:spacing w:lineRule="auto" w:line="276" w:after="120"/>
+        <w:ind w:left="724" w:hanging="57"/>
+        <w:jc w:val="both"/>
+        <w:rPr>
+          <w:rFonts w:ascii="標楷體" w:eastAsia="標楷體" w:hAnsi="標楷體" w:cs="標楷體"/>
+          <w:sz w:val="24"/>
+          <w:szCs w:val="24"/>
+        </w:rPr>
       </w:pPr>
       <w:r>
         <w:rPr>
@@ -494,6 +508,13 @@
     <w:p>
       <w:pPr>
         <w:spacing w:lineRule="auto" w:line="276" w:after="120"/>
+        <w:ind w:left="724" w:hanging="57"/>
+        <w:jc w:val="both"/>
+        <w:rPr>
+          <w:rFonts w:ascii="標楷體" w:eastAsia="標楷體" w:hAnsi="標楷體" w:cs="標楷體"/>
+          <w:sz w:val="24"/>
+          <w:szCs w:val="24"/>
+        </w:rPr>
       </w:pPr>
       <w:r>
         <w:rPr>
@@ -507,6 +528,13 @@
     <w:p>
       <w:pPr>
         <w:spacing w:lineRule="auto" w:line="276" w:after="120"/>
+        <w:ind w:left="724" w:hanging="57"/>
+        <w:jc w:val="both"/>
+        <w:rPr>
+          <w:rFonts w:ascii="標楷體" w:eastAsia="標楷體" w:hAnsi="標楷體" w:cs="標楷體"/>
+          <w:sz w:val="24"/>
+          <w:szCs w:val="24"/>
+        </w:rPr>
       </w:pPr>
       <w:r>
         <w:rPr>
@@ -576,6 +604,13 @@
     <w:p>
       <w:pPr>
         <w:spacing w:lineRule="auto" w:line="276" w:after="120"/>
+        <w:ind w:left="724" w:hanging="57"/>
+        <w:jc w:val="both"/>
+        <w:rPr>
+          <w:rFonts w:ascii="標楷體" w:eastAsia="標楷體" w:hAnsi="標楷體" w:cs="標楷體"/>
+          <w:sz w:val="24"/>
+          <w:szCs w:val="24"/>
+        </w:rPr>
       </w:pPr>
       <w:r>
         <w:rPr>
@@ -589,6 +624,13 @@
     <w:p>
       <w:pPr>
         <w:spacing w:lineRule="auto" w:line="276" w:after="120"/>
+        <w:ind w:left="724" w:hanging="57"/>
+        <w:jc w:val="both"/>
+        <w:rPr>
+          <w:rFonts w:ascii="標楷體" w:eastAsia="標楷體" w:hAnsi="標楷體" w:cs="標楷體"/>
+          <w:sz w:val="24"/>
+          <w:szCs w:val="24"/>
+        </w:rPr>
       </w:pPr>
       <w:r>
         <w:rPr>
@@ -602,6 +644,13 @@
     <w:p>
       <w:pPr>
         <w:spacing w:lineRule="auto" w:line="276" w:after="120"/>
+        <w:ind w:left="724" w:hanging="57"/>
+        <w:jc w:val="both"/>
+        <w:rPr>
+          <w:rFonts w:ascii="標楷體" w:eastAsia="標楷體" w:hAnsi="標楷體" w:cs="標楷體"/>
+          <w:sz w:val="24"/>
+          <w:szCs w:val="24"/>
+        </w:rPr>
       </w:pPr>
       <w:r>
         <w:rPr>
@@ -615,6 +664,13 @@
     <w:p>
       <w:pPr>
         <w:spacing w:lineRule="auto" w:line="276" w:after="120"/>
+        <w:ind w:left="724" w:hanging="57"/>
+        <w:jc w:val="both"/>
+        <w:rPr>
+          <w:rFonts w:ascii="標楷體" w:eastAsia="標楷體" w:hAnsi="標楷體" w:cs="標楷體"/>
+          <w:sz w:val="24"/>
+          <w:szCs w:val="24"/>
+        </w:rPr>
       </w:pPr>
       <w:r>
         <w:rPr>
@@ -628,6 +684,13 @@
     <w:p>
       <w:pPr>
         <w:spacing w:lineRule="auto" w:line="276" w:after="120"/>
+        <w:ind w:left="724" w:hanging="57"/>
+        <w:jc w:val="both"/>
+        <w:rPr>
+          <w:rFonts w:ascii="標楷體" w:eastAsia="標楷體" w:hAnsi="標楷體" w:cs="標楷體"/>
+          <w:sz w:val="24"/>
+          <w:szCs w:val="24"/>
+        </w:rPr>
       </w:pPr>
       <w:r>
         <w:rPr>
@@ -641,6 +704,13 @@
     <w:p>
       <w:pPr>
         <w:spacing w:lineRule="auto" w:line="276" w:after="120"/>
+        <w:ind w:left="724" w:hanging="57"/>
+        <w:jc w:val="both"/>
+        <w:rPr>
+          <w:rFonts w:ascii="標楷體" w:eastAsia="標楷體" w:hAnsi="標楷體" w:cs="標楷體"/>
+          <w:sz w:val="24"/>
+          <w:szCs w:val="24"/>
+        </w:rPr>
       </w:pPr>
       <w:r>
         <w:rPr>
@@ -710,6 +780,13 @@
     <w:p>
       <w:pPr>
         <w:spacing w:lineRule="auto" w:line="276" w:after="120"/>
+        <w:ind w:left="724" w:hanging="57"/>
+        <w:jc w:val="both"/>
+        <w:rPr>
+          <w:rFonts w:ascii="標楷體" w:eastAsia="標楷體" w:hAnsi="標楷體" w:cs="標楷體"/>
+          <w:sz w:val="24"/>
+          <w:szCs w:val="24"/>
+        </w:rPr>
       </w:pPr>
       <w:r>
         <w:rPr>
@@ -723,6 +800,13 @@
     <w:p>
       <w:pPr>
         <w:spacing w:lineRule="auto" w:line="276" w:after="120"/>
+        <w:ind w:left="724" w:hanging="57"/>
+        <w:jc w:val="both"/>
+        <w:rPr>
+          <w:rFonts w:ascii="標楷體" w:eastAsia="標楷體" w:hAnsi="標楷體" w:cs="標楷體"/>
+          <w:sz w:val="24"/>
+          <w:szCs w:val="24"/>
+        </w:rPr>
       </w:pPr>
       <w:r>
         <w:rPr>
@@ -736,6 +820,13 @@
     <w:p>
       <w:pPr>
         <w:spacing w:lineRule="auto" w:line="276" w:after="120"/>
+        <w:ind w:left="724" w:hanging="57"/>
+        <w:jc w:val="both"/>
+        <w:rPr>
+          <w:rFonts w:ascii="標楷體" w:eastAsia="標楷體" w:hAnsi="標楷體" w:cs="標楷體"/>
+          <w:sz w:val="24"/>
+          <w:szCs w:val="24"/>
+        </w:rPr>
       </w:pPr>
       <w:r>
         <w:rPr>
@@ -805,6 +896,13 @@
     <w:p>
       <w:pPr>
         <w:spacing w:lineRule="auto" w:line="276" w:after="120"/>
+        <w:ind w:left="724" w:hanging="57"/>
+        <w:jc w:val="both"/>
+        <w:rPr>
+          <w:rFonts w:ascii="標楷體" w:eastAsia="標楷體" w:hAnsi="標楷體" w:cs="標楷體"/>
+          <w:sz w:val="24"/>
+          <w:szCs w:val="24"/>
+        </w:rPr>
       </w:pPr>
       <w:r>
         <w:rPr>
@@ -818,6 +916,13 @@
     <w:p>
       <w:pPr>
         <w:spacing w:lineRule="auto" w:line="276" w:after="120"/>
+        <w:ind w:left="724" w:hanging="57"/>
+        <w:jc w:val="both"/>
+        <w:rPr>
+          <w:rFonts w:ascii="標楷體" w:eastAsia="標楷體" w:hAnsi="標楷體" w:cs="標楷體"/>
+          <w:sz w:val="24"/>
+          <w:szCs w:val="24"/>
+        </w:rPr>
       </w:pPr>
       <w:r>
         <w:rPr>
@@ -831,6 +936,13 @@
     <w:p>
       <w:pPr>
         <w:spacing w:lineRule="auto" w:line="276" w:after="120"/>
+        <w:ind w:left="724" w:hanging="57"/>
+        <w:jc w:val="both"/>
+        <w:rPr>
+          <w:rFonts w:ascii="標楷體" w:eastAsia="標楷體" w:hAnsi="標楷體" w:cs="標楷體"/>
+          <w:sz w:val="24"/>
+          <w:szCs w:val="24"/>
+        </w:rPr>
       </w:pPr>
       <w:r>
         <w:rPr>
@@ -844,6 +956,13 @@
     <w:p>
       <w:pPr>
         <w:spacing w:lineRule="auto" w:line="276" w:after="120"/>
+        <w:ind w:left="724" w:hanging="57"/>
+        <w:jc w:val="both"/>
+        <w:rPr>
+          <w:rFonts w:ascii="標楷體" w:eastAsia="標楷體" w:hAnsi="標楷體" w:cs="標楷體"/>
+          <w:sz w:val="24"/>
+          <w:szCs w:val="24"/>
+        </w:rPr>
       </w:pPr>
       <w:r>
         <w:rPr>
@@ -913,6 +1032,13 @@
     <w:p>
       <w:pPr>
         <w:spacing w:lineRule="auto" w:line="276" w:after="120"/>
+        <w:ind w:left="724" w:hanging="57"/>
+        <w:jc w:val="both"/>
+        <w:rPr>
+          <w:rFonts w:ascii="標楷體" w:eastAsia="標楷體" w:hAnsi="標楷體" w:cs="標楷體"/>
+          <w:sz w:val="24"/>
+          <w:szCs w:val="24"/>
+        </w:rPr>
       </w:pPr>
       <w:r>
         <w:rPr>
@@ -926,6 +1052,13 @@
     <w:p>
       <w:pPr>
         <w:spacing w:lineRule="auto" w:line="276" w:after="120"/>
+        <w:ind w:left="724" w:hanging="57"/>
+        <w:jc w:val="both"/>
+        <w:rPr>
+          <w:rFonts w:ascii="標楷體" w:eastAsia="標楷體" w:hAnsi="標楷體" w:cs="標楷體"/>
+          <w:sz w:val="24"/>
+          <w:szCs w:val="24"/>
+        </w:rPr>
       </w:pPr>
       <w:r>
         <w:rPr>
@@ -939,6 +1072,13 @@
     <w:p>
       <w:pPr>
         <w:spacing w:lineRule="auto" w:line="276" w:after="120"/>
+        <w:ind w:left="724" w:hanging="57"/>
+        <w:jc w:val="both"/>
+        <w:rPr>
+          <w:rFonts w:ascii="標楷體" w:eastAsia="標楷體" w:hAnsi="標楷體" w:cs="標楷體"/>
+          <w:sz w:val="24"/>
+          <w:szCs w:val="24"/>
+        </w:rPr>
       </w:pPr>
       <w:r>
         <w:rPr>
@@ -952,6 +1092,13 @@
     <w:p>
       <w:pPr>
         <w:spacing w:lineRule="auto" w:line="276" w:after="120"/>
+        <w:ind w:left="724" w:hanging="57"/>
+        <w:jc w:val="both"/>
+        <w:rPr>
+          <w:rFonts w:ascii="標楷體" w:eastAsia="標楷體" w:hAnsi="標楷體" w:cs="標楷體"/>
+          <w:sz w:val="24"/>
+          <w:szCs w:val="24"/>
+        </w:rPr>
       </w:pPr>
       <w:r>
         <w:rPr>
@@ -1021,6 +1168,13 @@
     <w:p>
       <w:pPr>
         <w:spacing w:lineRule="auto" w:line="276" w:after="120"/>
+        <w:ind w:left="724" w:hanging="57"/>
+        <w:jc w:val="both"/>
+        <w:rPr>
+          <w:rFonts w:ascii="標楷體" w:eastAsia="標楷體" w:hAnsi="標楷體" w:cs="標楷體"/>
+          <w:sz w:val="24"/>
+          <w:szCs w:val="24"/>
+        </w:rPr>
       </w:pPr>
       <w:r>
         <w:rPr>
@@ -1034,6 +1188,13 @@
     <w:p>
       <w:pPr>
         <w:spacing w:lineRule="auto" w:line="276" w:after="120"/>
+        <w:ind w:left="724" w:hanging="57"/>
+        <w:jc w:val="both"/>
+        <w:rPr>
+          <w:rFonts w:ascii="標楷體" w:eastAsia="標楷體" w:hAnsi="標楷體" w:cs="標楷體"/>
+          <w:sz w:val="24"/>
+          <w:szCs w:val="24"/>
+        </w:rPr>
       </w:pPr>
       <w:r>
         <w:rPr>
@@ -1047,6 +1208,13 @@
     <w:p>
       <w:pPr>
         <w:spacing w:lineRule="auto" w:line="276" w:after="120"/>
+        <w:ind w:left="724" w:hanging="57"/>
+        <w:jc w:val="both"/>
+        <w:rPr>
+          <w:rFonts w:ascii="標楷體" w:eastAsia="標楷體" w:hAnsi="標楷體" w:cs="標楷體"/>
+          <w:sz w:val="24"/>
+          <w:szCs w:val="24"/>
+        </w:rPr>
       </w:pPr>
       <w:r>
         <w:rPr>
@@ -1060,6 +1228,13 @@
     <w:p>
       <w:pPr>
         <w:spacing w:lineRule="auto" w:line="276" w:after="120"/>
+        <w:ind w:left="724" w:hanging="57"/>
+        <w:jc w:val="both"/>
+        <w:rPr>
+          <w:rFonts w:ascii="標楷體" w:eastAsia="標楷體" w:hAnsi="標楷體" w:cs="標楷體"/>
+          <w:sz w:val="24"/>
+          <w:szCs w:val="24"/>
+        </w:rPr>
       </w:pPr>
       <w:r>
         <w:rPr>
@@ -1073,6 +1248,13 @@
     <w:p>
       <w:pPr>
         <w:spacing w:lineRule="auto" w:line="276" w:after="120"/>
+        <w:ind w:left="724" w:hanging="57"/>
+        <w:jc w:val="both"/>
+        <w:rPr>
+          <w:rFonts w:ascii="標楷體" w:eastAsia="標楷體" w:hAnsi="標楷體" w:cs="標楷體"/>
+          <w:sz w:val="24"/>
+          <w:szCs w:val="24"/>
+        </w:rPr>
       </w:pPr>
       <w:r>
         <w:rPr>
@@ -1155,6 +1337,13 @@
     <w:p>
       <w:pPr>
         <w:spacing w:lineRule="auto" w:line="276" w:after="120"/>
+        <w:ind w:left="724" w:hanging="57"/>
+        <w:jc w:val="both"/>
+        <w:rPr>
+          <w:rFonts w:ascii="標楷體" w:eastAsia="標楷體" w:hAnsi="標楷體" w:cs="標楷體"/>
+          <w:sz w:val="24"/>
+          <w:szCs w:val="24"/>
+        </w:rPr>
       </w:pPr>
       <w:r>
         <w:rPr>
@@ -1224,6 +1413,13 @@
     <w:p>
       <w:pPr>
         <w:spacing w:lineRule="auto" w:line="276" w:after="120"/>
+        <w:ind w:left="724" w:hanging="57"/>
+        <w:jc w:val="both"/>
+        <w:rPr>
+          <w:rFonts w:ascii="標楷體" w:eastAsia="標楷體" w:hAnsi="標楷體" w:cs="標楷體"/>
+          <w:sz w:val="24"/>
+          <w:szCs w:val="24"/>
+        </w:rPr>
       </w:pPr>
       <w:r>
         <w:rPr>
@@ -1238,6 +1434,12 @@
       <w:pPr>
         <w:spacing w:lineRule="auto" w:line="276" w:after="120"/>
         <w:ind w:left="420" w:hanging="420"/>
+        <w:jc w:val="both"/>
+        <w:rPr>
+          <w:rFonts w:ascii="標楷體" w:eastAsia="標楷體" w:hAnsi="標楷體" w:cs="標楷體"/>
+          <w:sz w:val="24"/>
+          <w:szCs w:val="24"/>
+        </w:rPr>
       </w:pPr>
       <w:r>
         <w:rPr>
@@ -1252,6 +1454,12 @@
       <w:pPr>
         <w:spacing w:lineRule="auto" w:line="276" w:after="120"/>
         <w:ind w:left="420" w:hanging="420"/>
+        <w:jc w:val="both"/>
+        <w:rPr>
+          <w:rFonts w:ascii="標楷體" w:eastAsia="標楷體" w:hAnsi="標楷體" w:cs="標楷體"/>
+          <w:sz w:val="24"/>
+          <w:szCs w:val="24"/>
+        </w:rPr>
       </w:pPr>
       <w:r>
         <w:rPr>
@@ -1266,6 +1474,12 @@
       <w:pPr>
         <w:spacing w:lineRule="auto" w:line="276" w:after="120"/>
         <w:ind w:left="420" w:hanging="420"/>
+        <w:jc w:val="both"/>
+        <w:rPr>
+          <w:rFonts w:ascii="標楷體" w:eastAsia="標楷體" w:hAnsi="標楷體" w:cs="標楷體"/>
+          <w:sz w:val="24"/>
+          <w:szCs w:val="24"/>
+        </w:rPr>
       </w:pPr>
       <w:r>
         <w:rPr>
@@ -1280,6 +1494,12 @@
       <w:pPr>
         <w:spacing w:lineRule="auto" w:line="276" w:after="120"/>
         <w:ind w:left="420" w:hanging="420"/>
+        <w:jc w:val="both"/>
+        <w:rPr>
+          <w:rFonts w:ascii="標楷體" w:eastAsia="標楷體" w:hAnsi="標楷體" w:cs="標楷體"/>
+          <w:sz w:val="24"/>
+          <w:szCs w:val="24"/>
+        </w:rPr>
       </w:pPr>
       <w:r>
         <w:rPr>
@@ -1294,6 +1514,12 @@
       <w:pPr>
         <w:spacing w:lineRule="auto" w:line="276" w:after="120"/>
         <w:ind w:left="420" w:hanging="420"/>
+        <w:jc w:val="both"/>
+        <w:rPr>
+          <w:rFonts w:ascii="標楷體" w:eastAsia="標楷體" w:hAnsi="標楷體" w:cs="標楷體"/>
+          <w:sz w:val="24"/>
+          <w:szCs w:val="24"/>
+        </w:rPr>
       </w:pPr>
       <w:r>
         <w:rPr>
@@ -1308,6 +1534,12 @@
       <w:pPr>
         <w:spacing w:lineRule="auto" w:line="276" w:after="120"/>
         <w:ind w:left="420" w:hanging="420"/>
+        <w:jc w:val="both"/>
+        <w:rPr>
+          <w:rFonts w:ascii="標楷體" w:eastAsia="標楷體" w:hAnsi="標楷體" w:cs="標楷體"/>
+          <w:sz w:val="24"/>
+          <w:szCs w:val="24"/>
+        </w:rPr>
       </w:pPr>
       <w:r>
         <w:rPr>
@@ -1322,6 +1554,12 @@
       <w:pPr>
         <w:spacing w:lineRule="auto" w:line="276" w:after="120"/>
         <w:ind w:left="420" w:hanging="420"/>
+        <w:jc w:val="both"/>
+        <w:rPr>
+          <w:rFonts w:ascii="標楷體" w:eastAsia="標楷體" w:hAnsi="標楷體" w:cs="標楷體"/>
+          <w:sz w:val="24"/>
+          <w:szCs w:val="24"/>
+        </w:rPr>
       </w:pPr>
       <w:r>
         <w:rPr>
@@ -1336,6 +1574,12 @@
       <w:pPr>
         <w:spacing w:lineRule="auto" w:line="276" w:after="120"/>
         <w:ind w:left="420" w:hanging="420"/>
+        <w:jc w:val="both"/>
+        <w:rPr>
+          <w:rFonts w:ascii="標楷體" w:eastAsia="標楷體" w:hAnsi="標楷體" w:cs="標楷體"/>
+          <w:sz w:val="24"/>
+          <w:szCs w:val="24"/>
+        </w:rPr>
       </w:pPr>
       <w:r>
         <w:rPr>
@@ -1350,6 +1594,12 @@
       <w:pPr>
         <w:spacing w:lineRule="auto" w:line="276" w:after="120"/>
         <w:ind w:left="420" w:hanging="420"/>
+        <w:jc w:val="both"/>
+        <w:rPr>
+          <w:rFonts w:ascii="標楷體" w:eastAsia="標楷體" w:hAnsi="標楷體" w:cs="標楷體"/>
+          <w:sz w:val="24"/>
+          <w:szCs w:val="24"/>
+        </w:rPr>
       </w:pPr>
       <w:r>
         <w:rPr>
@@ -1364,6 +1614,12 @@
       <w:pPr>
         <w:spacing w:lineRule="auto" w:line="276" w:after="120"/>
         <w:ind w:left="420" w:hanging="420"/>
+        <w:jc w:val="both"/>
+        <w:rPr>
+          <w:rFonts w:ascii="標楷體" w:eastAsia="標楷體" w:hAnsi="標楷體" w:cs="標楷體"/>
+          <w:sz w:val="24"/>
+          <w:szCs w:val="24"/>
+        </w:rPr>
       </w:pPr>
       <w:r>
         <w:rPr>
@@ -1378,6 +1634,12 @@
       <w:pPr>
         <w:spacing w:lineRule="auto" w:line="276" w:after="120"/>
         <w:ind w:left="420" w:hanging="420"/>
+        <w:jc w:val="both"/>
+        <w:rPr>
+          <w:rFonts w:ascii="標楷體" w:eastAsia="標楷體" w:hAnsi="標楷體" w:cs="標楷體"/>
+          <w:sz w:val="24"/>
+          <w:szCs w:val="24"/>
+        </w:rPr>
       </w:pPr>
       <w:r>
         <w:rPr>
@@ -1392,6 +1654,12 @@
       <w:pPr>
         <w:spacing w:lineRule="auto" w:line="276" w:after="120"/>
         <w:ind w:left="420" w:hanging="420"/>
+        <w:jc w:val="both"/>
+        <w:rPr>
+          <w:rFonts w:ascii="標楷體" w:eastAsia="標楷體" w:hAnsi="標楷體" w:cs="標楷體"/>
+          <w:sz w:val="24"/>
+          <w:szCs w:val="24"/>
+        </w:rPr>
       </w:pPr>
       <w:r>
         <w:rPr>

</xml_diff>

<commit_message>
fix(report): use 教育部標準楷書 (EduKai) for CJK so it renders on macOS
標楷體 (DFKai-SB) ships only with Windows, so on a Mac it substitutes to a
non-Kai fallback. Default the report's CJK font to the Ministry of Education's
free official 楷書「教育部標準楷書」(EduKai, works on Mac + Windows) and retarget
every run (headings/notes/table incl. baked-in 標楷體) so CJK→EduKai and
Latin/digits→Times New Roman uniformly. CN font overridable via REPORT_CN_FONT
(set to 標楷體 when exporting the PDF on Windows).

Co-Authored-By: Claude Opus 4.8 (1M context) <noreply@anthropic.com>
</commit_message>
<xml_diff>
--- a/report/TEAM_10505_ESG永續承諾驗證競賽.docx
+++ b/report/TEAM_10505_ESG永續承諾驗證競賽.docx
@@ -7,7 +7,7 @@
         <w:spacing w:lineRule="auto" w:line="276" w:after="120"/>
         <w:jc w:val="center"/>
         <w:rPr>
-          <w:rFonts w:ascii="標楷體" w:eastAsia="標楷體" w:hAnsi="標楷體" w:cs="標楷體"/>
+          <w:rFonts w:ascii="Times New Roman" w:eastAsia="教育部標準楷書" w:hAnsi="Times New Roman" w:cs="教育部標準楷書"/>
           <w:b/>
           <w:bCs/>
           <w:sz w:val="36"/>
@@ -16,7 +16,7 @@
       </w:pPr>
       <w:r>
         <w:rPr>
-          <w:rFonts w:ascii="標楷體" w:eastAsia="標楷體" w:hAnsi="標楷體" w:cs="標楷體"/>
+          <w:rFonts w:ascii="Times New Roman" w:eastAsia="教育部標準楷書" w:hAnsi="Times New Roman" w:cs="教育部標準楷書"/>
           <w:b/>
           <w:bCs/>
           <w:sz w:val="36"/>
@@ -79,7 +79,7 @@
                             </w:pPr>
                             <w:r>
                               <w:rPr>
-                                <w:rFonts w:ascii="標楷體" w:eastAsia="標楷體" w:hAnsi="標楷體" w:cs="標楷體"/>
+                                <w:rFonts w:ascii="Times New Roman" w:eastAsia="教育部標準楷書" w:hAnsi="Times New Roman" w:cs="教育部標準楷書"/>
                                 <w:color w:val="000000"/>
                                 <w:sz w:val="24"/>
                               </w:rPr>
@@ -111,7 +111,7 @@
                       </w:pPr>
                       <w:r>
                         <w:rPr>
-                          <w:rFonts w:ascii="標楷體" w:eastAsia="標楷體" w:hAnsi="標楷體" w:cs="標楷體"/>
+                          <w:rFonts w:ascii="Times New Roman" w:eastAsia="教育部標準楷書" w:hAnsi="Times New Roman" w:cs="教育部標準楷書"/>
                           <w:color w:val="000000"/>
                           <w:sz w:val="24"/>
                         </w:rPr>
@@ -131,7 +131,7 @@
         <w:spacing w:lineRule="auto" w:line="276" w:after="120"/>
         <w:jc w:val="center"/>
         <w:rPr>
-          <w:rFonts w:ascii="標楷體" w:eastAsia="標楷體" w:hAnsi="標楷體" w:cs="標楷體"/>
+          <w:rFonts w:ascii="Times New Roman" w:eastAsia="教育部標準楷書" w:hAnsi="Times New Roman" w:cs="教育部標準楷書"/>
           <w:b/>
           <w:bCs/>
           <w:sz w:val="36"/>
@@ -140,7 +140,7 @@
       </w:pPr>
       <w:r>
         <w:rPr>
-          <w:rFonts w:ascii="標楷體" w:eastAsia="標楷體" w:hAnsi="標楷體" w:cs="標楷體"/>
+          <w:rFonts w:ascii="Times New Roman" w:eastAsia="教育部標準楷書" w:hAnsi="Times New Roman" w:cs="教育部標準楷書"/>
           <w:b/>
           <w:bCs/>
           <w:sz w:val="36"/>
@@ -154,7 +154,7 @@
         <w:spacing w:lineRule="auto" w:line="276" w:after="120"/>
         <w:jc w:val="both"/>
         <w:rPr>
-          <w:rFonts w:ascii="標楷體" w:eastAsia="標楷體" w:hAnsi="標楷體" w:cs="標楷體"/>
+          <w:rFonts w:ascii="Times New Roman" w:eastAsia="教育部標準楷書" w:hAnsi="Times New Roman" w:cs="教育部標準楷書"/>
           <w:sz w:val="32"/>
           <w:szCs w:val="32"/>
         </w:rPr>
@@ -173,7 +173,7 @@
         <w:ind w:left="4" w:hanging="57"/>
         <w:jc w:val="both"/>
         <w:rPr>
-          <w:rFonts w:ascii="標楷體" w:eastAsia="標楷體" w:hAnsi="標楷體" w:cs="標楷體"/>
+          <w:rFonts w:ascii="Times New Roman" w:eastAsia="教育部標準楷書" w:hAnsi="Times New Roman" w:cs="教育部標準楷書"/>
           <w:b/>
           <w:bCs/>
           <w:sz w:val="36"/>
@@ -182,7 +182,7 @@
       </w:pPr>
       <w:r>
         <w:rPr>
-          <w:rFonts w:ascii="標楷體" w:eastAsia="標楷體" w:hAnsi="標楷體" w:cs="標楷體"/>
+          <w:rFonts w:ascii="Times New Roman" w:eastAsia="教育部標準楷書" w:hAnsi="Times New Roman" w:cs="教育部標準楷書"/>
           <w:b/>
           <w:bCs/>
           <w:sz w:val="36"/>
@@ -196,14 +196,14 @@
         <w:spacing w:lineRule="auto" w:line="276" w:after="120"/>
         <w:jc w:val="both"/>
         <w:rPr>
-          <w:rFonts w:ascii="標楷體" w:eastAsia="標楷體" w:hAnsi="標楷體" w:cs="標楷體"/>
-          <w:sz w:val="24"/>
-          <w:szCs w:val="24"/>
-        </w:rPr>
-      </w:pPr>
-      <w:r>
-        <w:rPr>
-          <w:rFonts w:ascii="Times New Roman" w:hAnsi="Times New Roman" w:eastAsia="標楷體"/>
+          <w:rFonts w:ascii="Times New Roman" w:eastAsia="教育部標準楷書" w:hAnsi="Times New Roman" w:cs="教育部標準楷書"/>
+          <w:sz w:val="24"/>
+          <w:szCs w:val="24"/>
+        </w:rPr>
+      </w:pPr>
+      <w:r>
+        <w:rPr>
+          <w:rFonts w:ascii="Times New Roman" w:hAnsi="Times New Roman" w:eastAsia="教育部標準楷書"/>
           <w:b w:val="0"/>
           <w:sz w:val="24"/>
         </w:rPr>
@@ -215,7 +215,7 @@
         <w:spacing w:lineRule="auto" w:line="276" w:after="120"/>
         <w:jc w:val="both"/>
         <w:rPr>
-          <w:rFonts w:ascii="標楷體" w:eastAsia="標楷體" w:hAnsi="標楷體" w:cs="標楷體"/>
+          <w:rFonts w:ascii="Times New Roman" w:eastAsia="教育部標準楷書" w:hAnsi="Times New Roman" w:cs="教育部標準楷書"/>
           <w:color w:val="FF0000"/>
           <w:sz w:val="24"/>
           <w:szCs w:val="24"/>
@@ -223,7 +223,7 @@
       </w:pPr>
       <w:r>
         <w:rPr>
-          <w:rFonts w:ascii="標楷體" w:eastAsia="標楷體" w:hAnsi="標楷體" w:cs="標楷體"/>
+          <w:rFonts w:ascii="Times New Roman" w:eastAsia="教育部標準楷書" w:hAnsi="Times New Roman" w:cs="教育部標準楷書"/>
           <w:sz w:val="24"/>
           <w:szCs w:val="24"/>
         </w:rPr>
@@ -231,7 +231,7 @@
       </w:r>
       <w:r>
         <w:rPr>
-          <w:rFonts w:ascii="標楷體" w:eastAsia="標楷體" w:hAnsi="標楷體" w:cs="標楷體"/>
+          <w:rFonts w:ascii="Times New Roman" w:eastAsia="教育部標準楷書" w:hAnsi="Times New Roman" w:cs="教育部標準楷書"/>
           <w:color w:val="FF0000"/>
           <w:sz w:val="24"/>
           <w:szCs w:val="24"/>
@@ -244,14 +244,14 @@
         <w:spacing w:lineRule="auto" w:line="276" w:after="120"/>
         <w:jc w:val="both"/>
         <w:rPr>
-          <w:rFonts w:ascii="標楷體" w:eastAsia="標楷體" w:hAnsi="標楷體" w:cs="標楷體"/>
-          <w:sz w:val="24"/>
-          <w:szCs w:val="24"/>
-        </w:rPr>
-      </w:pPr>
-      <w:r>
-        <w:rPr>
-          <w:rFonts w:ascii="標楷體" w:eastAsia="標楷體" w:hAnsi="標楷體" w:cs="標楷體"/>
+          <w:rFonts w:ascii="Times New Roman" w:eastAsia="教育部標準楷書" w:hAnsi="Times New Roman" w:cs="教育部標準楷書"/>
+          <w:sz w:val="24"/>
+          <w:szCs w:val="24"/>
+        </w:rPr>
+      </w:pPr>
+      <w:r>
+        <w:rPr>
+          <w:rFonts w:ascii="Times New Roman" w:eastAsia="教育部標準楷書" w:hAnsi="Times New Roman" w:cs="教育部標準楷書"/>
           <w:sz w:val="24"/>
           <w:szCs w:val="24"/>
         </w:rPr>
@@ -259,7 +259,7 @@
       </w:r>
       <w:r>
         <w:rPr>
-          <w:rFonts w:ascii="標楷體" w:eastAsia="標楷體" w:hAnsi="標楷體" w:cs="標楷體"/>
+          <w:rFonts w:ascii="Times New Roman" w:eastAsia="教育部標準楷書" w:hAnsi="Times New Roman" w:cs="教育部標準楷書"/>
           <w:color w:val="FF0000"/>
           <w:sz w:val="24"/>
           <w:szCs w:val="24"/>
@@ -283,14 +283,14 @@
         <w:spacing w:lineRule="auto" w:line="276" w:after="120"/>
         <w:jc w:val="both"/>
         <w:rPr>
-          <w:rFonts w:ascii="標楷體" w:eastAsia="標楷體" w:hAnsi="標楷體" w:cs="標楷體"/>
-          <w:sz w:val="24"/>
-          <w:szCs w:val="24"/>
-        </w:rPr>
-      </w:pPr>
-      <w:r>
-        <w:rPr>
-          <w:rFonts w:ascii="標楷體" w:eastAsia="標楷體" w:hAnsi="標楷體" w:cs="標楷體"/>
+          <w:rFonts w:ascii="Times New Roman" w:eastAsia="教育部標準楷書" w:hAnsi="Times New Roman" w:cs="教育部標準楷書"/>
+          <w:sz w:val="24"/>
+          <w:szCs w:val="24"/>
+        </w:rPr>
+      </w:pPr>
+      <w:r>
+        <w:rPr>
+          <w:rFonts w:ascii="Times New Roman" w:eastAsia="教育部標準楷書" w:hAnsi="Times New Roman" w:cs="教育部標準楷書"/>
           <w:sz w:val="24"/>
           <w:szCs w:val="24"/>
         </w:rPr>
@@ -313,14 +313,14 @@
         <w:spacing w:lineRule="auto" w:line="276" w:after="120"/>
         <w:jc w:val="both"/>
         <w:rPr>
-          <w:rFonts w:ascii="標楷體" w:eastAsia="標楷體" w:hAnsi="標楷體" w:cs="標楷體"/>
-          <w:sz w:val="24"/>
-          <w:szCs w:val="24"/>
-        </w:rPr>
-      </w:pPr>
-      <w:r>
-        <w:rPr>
-          <w:rFonts w:ascii="標楷體" w:eastAsia="標楷體" w:hAnsi="標楷體" w:cs="標楷體"/>
+          <w:rFonts w:ascii="Times New Roman" w:eastAsia="教育部標準楷書" w:hAnsi="Times New Roman" w:cs="教育部標準楷書"/>
+          <w:sz w:val="24"/>
+          <w:szCs w:val="24"/>
+        </w:rPr>
+      </w:pPr>
+      <w:r>
+        <w:rPr>
+          <w:rFonts w:ascii="Times New Roman" w:eastAsia="教育部標準楷書" w:hAnsi="Times New Roman" w:cs="教育部標準楷書"/>
           <w:sz w:val="24"/>
           <w:szCs w:val="24"/>
         </w:rPr>
@@ -343,14 +343,14 @@
         <w:spacing w:lineRule="auto" w:line="276" w:after="120"/>
         <w:jc w:val="both"/>
         <w:rPr>
-          <w:rFonts w:ascii="標楷體" w:eastAsia="標楷體" w:hAnsi="標楷體" w:cs="標楷體"/>
-          <w:sz w:val="24"/>
-          <w:szCs w:val="24"/>
-        </w:rPr>
-      </w:pPr>
-      <w:r>
-        <w:rPr>
-          <w:rFonts w:ascii="標楷體" w:eastAsia="標楷體" w:hAnsi="標楷體" w:cs="標楷體"/>
+          <w:rFonts w:ascii="Times New Roman" w:eastAsia="教育部標準楷書" w:hAnsi="Times New Roman" w:cs="教育部標準楷書"/>
+          <w:sz w:val="24"/>
+          <w:szCs w:val="24"/>
+        </w:rPr>
+      </w:pPr>
+      <w:r>
+        <w:rPr>
+          <w:rFonts w:ascii="Times New Roman" w:eastAsia="教育部標準楷書" w:hAnsi="Times New Roman" w:cs="教育部標準楷書"/>
           <w:sz w:val="24"/>
           <w:szCs w:val="24"/>
         </w:rPr>
@@ -373,14 +373,14 @@
         <w:spacing w:lineRule="auto" w:line="276" w:after="120"/>
         <w:jc w:val="both"/>
         <w:rPr>
-          <w:rFonts w:ascii="標楷體" w:eastAsia="標楷體" w:hAnsi="標楷體" w:cs="標楷體"/>
-          <w:sz w:val="24"/>
-          <w:szCs w:val="24"/>
-        </w:rPr>
-      </w:pPr>
-      <w:r>
-        <w:rPr>
-          <w:rFonts w:ascii="標楷體" w:eastAsia="標楷體" w:hAnsi="標楷體" w:cs="標楷體"/>
+          <w:rFonts w:ascii="Times New Roman" w:eastAsia="教育部標準楷書" w:hAnsi="Times New Roman" w:cs="教育部標準楷書"/>
+          <w:sz w:val="24"/>
+          <w:szCs w:val="24"/>
+        </w:rPr>
+      </w:pPr>
+      <w:r>
+        <w:rPr>
+          <w:rFonts w:ascii="Times New Roman" w:eastAsia="教育部標準楷書" w:hAnsi="Times New Roman" w:cs="教育部標準楷書"/>
           <w:sz w:val="24"/>
           <w:szCs w:val="24"/>
         </w:rPr>
@@ -392,7 +392,7 @@
         <w:spacing w:lineRule="auto" w:line="276" w:after="120"/>
         <w:jc w:val="both"/>
         <w:rPr>
-          <w:rFonts w:ascii="標楷體" w:eastAsia="標楷體" w:hAnsi="標楷體" w:cs="標楷體"/>
+          <w:rFonts w:ascii="Times New Roman" w:eastAsia="教育部標準楷書" w:hAnsi="Times New Roman" w:cs="教育部標準楷書"/>
           <w:sz w:val="24"/>
           <w:szCs w:val="24"/>
         </w:rPr>
@@ -403,7 +403,7 @@
       <w:proofErr w:type="gramEnd"/>
       <w:r>
         <w:rPr>
-          <w:rFonts w:ascii="Times New Roman" w:hAnsi="Times New Roman" w:eastAsia="標楷體"/>
+          <w:rFonts w:ascii="Times New Roman" w:hAnsi="Times New Roman" w:eastAsia="教育部標準楷書"/>
           <w:b w:val="0"/>
           <w:sz w:val="24"/>
         </w:rPr>
@@ -415,7 +415,7 @@
         <w:spacing w:lineRule="auto" w:line="276" w:after="120"/>
         <w:jc w:val="both"/>
         <w:rPr>
-          <w:rFonts w:ascii="標楷體" w:eastAsia="標楷體" w:hAnsi="標楷體" w:cs="標楷體"/>
+          <w:rFonts w:ascii="Times New Roman" w:eastAsia="教育部標準楷書" w:hAnsi="Times New Roman" w:cs="教育部標準楷書"/>
           <w:sz w:val="24"/>
           <w:szCs w:val="24"/>
         </w:rPr>
@@ -427,7 +427,7 @@
         <w:ind w:left="4" w:hanging="57"/>
         <w:jc w:val="both"/>
         <w:rPr>
-          <w:rFonts w:ascii="標楷體" w:eastAsia="標楷體" w:hAnsi="標楷體" w:cs="標楷體"/>
+          <w:rFonts w:ascii="Times New Roman" w:eastAsia="教育部標準楷書" w:hAnsi="Times New Roman" w:cs="教育部標準楷書"/>
           <w:b/>
           <w:bCs/>
           <w:sz w:val="36"/>
@@ -436,7 +436,7 @@
       </w:pPr>
       <w:r>
         <w:rPr>
-          <w:rFonts w:ascii="標楷體" w:eastAsia="標楷體" w:hAnsi="標楷體" w:cs="標楷體"/>
+          <w:rFonts w:ascii="Times New Roman" w:eastAsia="教育部標準楷書" w:hAnsi="Times New Roman" w:cs="教育部標準楷書"/>
           <w:b/>
           <w:bCs/>
           <w:sz w:val="36"/>
@@ -451,14 +451,14 @@
         <w:ind w:left="724" w:hanging="57"/>
         <w:jc w:val="both"/>
         <w:rPr>
-          <w:rFonts w:ascii="標楷體" w:eastAsia="標楷體" w:hAnsi="標楷體" w:cs="標楷體"/>
-          <w:sz w:val="24"/>
-          <w:szCs w:val="24"/>
-        </w:rPr>
-      </w:pPr>
-      <w:r>
-        <w:rPr>
-          <w:rFonts w:ascii="Times New Roman" w:hAnsi="Times New Roman" w:eastAsia="標楷體"/>
+          <w:rFonts w:ascii="Times New Roman" w:eastAsia="教育部標準楷書" w:hAnsi="Times New Roman" w:cs="教育部標準楷書"/>
+          <w:sz w:val="24"/>
+          <w:szCs w:val="24"/>
+        </w:rPr>
+      </w:pPr>
+      <w:r>
+        <w:rPr>
+          <w:rFonts w:ascii="Times New Roman" w:hAnsi="Times New Roman" w:eastAsia="教育部標準楷書"/>
           <w:b w:val="0"/>
           <w:sz w:val="24"/>
         </w:rPr>
@@ -471,14 +471,14 @@
         <w:ind w:left="724" w:hanging="57"/>
         <w:jc w:val="both"/>
         <w:rPr>
-          <w:rFonts w:ascii="標楷體" w:eastAsia="標楷體" w:hAnsi="標楷體" w:cs="標楷體"/>
-          <w:sz w:val="24"/>
-          <w:szCs w:val="24"/>
-        </w:rPr>
-      </w:pPr>
-      <w:r>
-        <w:rPr>
-          <w:rFonts w:ascii="Times New Roman" w:hAnsi="Times New Roman" w:eastAsia="標楷體"/>
+          <w:rFonts w:ascii="Times New Roman" w:eastAsia="教育部標準楷書" w:hAnsi="Times New Roman" w:cs="教育部標準楷書"/>
+          <w:sz w:val="24"/>
+          <w:szCs w:val="24"/>
+        </w:rPr>
+      </w:pPr>
+      <w:r>
+        <w:rPr>
+          <w:rFonts w:ascii="Times New Roman" w:hAnsi="Times New Roman" w:eastAsia="教育部標準楷書"/>
           <w:b w:val="0"/>
           <w:sz w:val="24"/>
         </w:rPr>
@@ -491,14 +491,14 @@
         <w:ind w:left="724" w:hanging="57"/>
         <w:jc w:val="both"/>
         <w:rPr>
-          <w:rFonts w:ascii="標楷體" w:eastAsia="標楷體" w:hAnsi="標楷體" w:cs="標楷體"/>
-          <w:sz w:val="24"/>
-          <w:szCs w:val="24"/>
-        </w:rPr>
-      </w:pPr>
-      <w:r>
-        <w:rPr>
-          <w:rFonts w:ascii="Times New Roman" w:hAnsi="Times New Roman" w:eastAsia="標楷體"/>
+          <w:rFonts w:ascii="Times New Roman" w:eastAsia="教育部標準楷書" w:hAnsi="Times New Roman" w:cs="教育部標準楷書"/>
+          <w:sz w:val="24"/>
+          <w:szCs w:val="24"/>
+        </w:rPr>
+      </w:pPr>
+      <w:r>
+        <w:rPr>
+          <w:rFonts w:ascii="Times New Roman" w:hAnsi="Times New Roman" w:eastAsia="教育部標準楷書"/>
           <w:b w:val="0"/>
           <w:sz w:val="24"/>
         </w:rPr>
@@ -511,14 +511,14 @@
         <w:ind w:left="724" w:hanging="57"/>
         <w:jc w:val="both"/>
         <w:rPr>
-          <w:rFonts w:ascii="標楷體" w:eastAsia="標楷體" w:hAnsi="標楷體" w:cs="標楷體"/>
-          <w:sz w:val="24"/>
-          <w:szCs w:val="24"/>
-        </w:rPr>
-      </w:pPr>
-      <w:r>
-        <w:rPr>
-          <w:rFonts w:ascii="Times New Roman" w:hAnsi="Times New Roman" w:eastAsia="標楷體"/>
+          <w:rFonts w:ascii="Times New Roman" w:eastAsia="教育部標準楷書" w:hAnsi="Times New Roman" w:cs="教育部標準楷書"/>
+          <w:sz w:val="24"/>
+          <w:szCs w:val="24"/>
+        </w:rPr>
+      </w:pPr>
+      <w:r>
+        <w:rPr>
+          <w:rFonts w:ascii="Times New Roman" w:hAnsi="Times New Roman" w:eastAsia="教育部標準楷書"/>
           <w:b w:val="0"/>
           <w:sz w:val="24"/>
         </w:rPr>
@@ -531,14 +531,14 @@
         <w:ind w:left="724" w:hanging="57"/>
         <w:jc w:val="both"/>
         <w:rPr>
-          <w:rFonts w:ascii="標楷體" w:eastAsia="標楷體" w:hAnsi="標楷體" w:cs="標楷體"/>
-          <w:sz w:val="24"/>
-          <w:szCs w:val="24"/>
-        </w:rPr>
-      </w:pPr>
-      <w:r>
-        <w:rPr>
-          <w:rFonts w:ascii="Times New Roman" w:hAnsi="Times New Roman" w:eastAsia="標楷體"/>
+          <w:rFonts w:ascii="Times New Roman" w:eastAsia="教育部標準楷書" w:hAnsi="Times New Roman" w:cs="教育部標準楷書"/>
+          <w:sz w:val="24"/>
+          <w:szCs w:val="24"/>
+        </w:rPr>
+      </w:pPr>
+      <w:r>
+        <w:rPr>
+          <w:rFonts w:ascii="Times New Roman" w:hAnsi="Times New Roman" w:eastAsia="教育部標準楷書"/>
           <w:b w:val="0"/>
           <w:sz w:val="24"/>
         </w:rPr>
@@ -551,7 +551,7 @@
         <w:ind w:left="724" w:hanging="57"/>
         <w:jc w:val="both"/>
         <w:rPr>
-          <w:rFonts w:ascii="標楷體" w:eastAsia="標楷體" w:hAnsi="標楷體" w:cs="標楷體"/>
+          <w:rFonts w:ascii="Times New Roman" w:eastAsia="教育部標準楷書" w:hAnsi="Times New Roman" w:cs="教育部標準楷書"/>
           <w:sz w:val="24"/>
           <w:szCs w:val="24"/>
         </w:rPr>
@@ -563,7 +563,7 @@
         <w:ind w:left="4" w:hanging="57"/>
         <w:jc w:val="both"/>
         <w:rPr>
-          <w:rFonts w:ascii="標楷體" w:eastAsia="標楷體" w:hAnsi="標楷體" w:cs="標楷體"/>
+          <w:rFonts w:ascii="Times New Roman" w:eastAsia="教育部標準楷書" w:hAnsi="Times New Roman" w:cs="教育部標準楷書"/>
           <w:b/>
           <w:bCs/>
           <w:sz w:val="36"/>
@@ -572,7 +572,7 @@
       </w:pPr>
       <w:r>
         <w:rPr>
-          <w:rFonts w:ascii="標楷體" w:eastAsia="標楷體" w:hAnsi="標楷體" w:cs="標楷體"/>
+          <w:rFonts w:ascii="Times New Roman" w:eastAsia="教育部標準楷書" w:hAnsi="Times New Roman" w:cs="教育部標準楷書"/>
           <w:b/>
           <w:bCs/>
           <w:sz w:val="36"/>
@@ -587,14 +587,14 @@
         <w:ind w:left="724" w:hanging="57"/>
         <w:jc w:val="both"/>
         <w:rPr>
-          <w:rFonts w:ascii="標楷體" w:eastAsia="標楷體" w:hAnsi="標楷體" w:cs="標楷體"/>
-          <w:sz w:val="24"/>
-          <w:szCs w:val="24"/>
-        </w:rPr>
-      </w:pPr>
-      <w:r>
-        <w:rPr>
-          <w:rFonts w:ascii="Times New Roman" w:hAnsi="Times New Roman" w:eastAsia="標楷體"/>
+          <w:rFonts w:ascii="Times New Roman" w:eastAsia="教育部標準楷書" w:hAnsi="Times New Roman" w:cs="教育部標準楷書"/>
+          <w:sz w:val="24"/>
+          <w:szCs w:val="24"/>
+        </w:rPr>
+      </w:pPr>
+      <w:r>
+        <w:rPr>
+          <w:rFonts w:ascii="Times New Roman" w:hAnsi="Times New Roman" w:eastAsia="教育部標準楷書"/>
           <w:b w:val="0"/>
           <w:sz w:val="24"/>
         </w:rPr>
@@ -607,14 +607,14 @@
         <w:ind w:left="724" w:hanging="57"/>
         <w:jc w:val="both"/>
         <w:rPr>
-          <w:rFonts w:ascii="標楷體" w:eastAsia="標楷體" w:hAnsi="標楷體" w:cs="標楷體"/>
-          <w:sz w:val="24"/>
-          <w:szCs w:val="24"/>
-        </w:rPr>
-      </w:pPr>
-      <w:r>
-        <w:rPr>
-          <w:rFonts w:ascii="Times New Roman" w:hAnsi="Times New Roman" w:eastAsia="標楷體"/>
+          <w:rFonts w:ascii="Times New Roman" w:eastAsia="教育部標準楷書" w:hAnsi="Times New Roman" w:cs="教育部標準楷書"/>
+          <w:sz w:val="24"/>
+          <w:szCs w:val="24"/>
+        </w:rPr>
+      </w:pPr>
+      <w:r>
+        <w:rPr>
+          <w:rFonts w:ascii="Times New Roman" w:hAnsi="Times New Roman" w:eastAsia="教育部標準楷書"/>
           <w:b w:val="0"/>
           <w:sz w:val="24"/>
         </w:rPr>
@@ -627,14 +627,14 @@
         <w:ind w:left="724" w:hanging="57"/>
         <w:jc w:val="both"/>
         <w:rPr>
-          <w:rFonts w:ascii="標楷體" w:eastAsia="標楷體" w:hAnsi="標楷體" w:cs="標楷體"/>
-          <w:sz w:val="24"/>
-          <w:szCs w:val="24"/>
-        </w:rPr>
-      </w:pPr>
-      <w:r>
-        <w:rPr>
-          <w:rFonts w:ascii="Times New Roman" w:hAnsi="Times New Roman" w:eastAsia="標楷體"/>
+          <w:rFonts w:ascii="Times New Roman" w:eastAsia="教育部標準楷書" w:hAnsi="Times New Roman" w:cs="教育部標準楷書"/>
+          <w:sz w:val="24"/>
+          <w:szCs w:val="24"/>
+        </w:rPr>
+      </w:pPr>
+      <w:r>
+        <w:rPr>
+          <w:rFonts w:ascii="Times New Roman" w:hAnsi="Times New Roman" w:eastAsia="教育部標準楷書"/>
           <w:b w:val="0"/>
           <w:sz w:val="24"/>
         </w:rPr>
@@ -647,14 +647,14 @@
         <w:ind w:left="724" w:hanging="57"/>
         <w:jc w:val="both"/>
         <w:rPr>
-          <w:rFonts w:ascii="標楷體" w:eastAsia="標楷體" w:hAnsi="標楷體" w:cs="標楷體"/>
-          <w:sz w:val="24"/>
-          <w:szCs w:val="24"/>
-        </w:rPr>
-      </w:pPr>
-      <w:r>
-        <w:rPr>
-          <w:rFonts w:ascii="Times New Roman" w:hAnsi="Times New Roman" w:eastAsia="標楷體"/>
+          <w:rFonts w:ascii="Times New Roman" w:eastAsia="教育部標準楷書" w:hAnsi="Times New Roman" w:cs="教育部標準楷書"/>
+          <w:sz w:val="24"/>
+          <w:szCs w:val="24"/>
+        </w:rPr>
+      </w:pPr>
+      <w:r>
+        <w:rPr>
+          <w:rFonts w:ascii="Times New Roman" w:hAnsi="Times New Roman" w:eastAsia="教育部標準楷書"/>
           <w:b w:val="0"/>
           <w:sz w:val="24"/>
         </w:rPr>
@@ -667,14 +667,14 @@
         <w:ind w:left="724" w:hanging="57"/>
         <w:jc w:val="both"/>
         <w:rPr>
-          <w:rFonts w:ascii="標楷體" w:eastAsia="標楷體" w:hAnsi="標楷體" w:cs="標楷體"/>
-          <w:sz w:val="24"/>
-          <w:szCs w:val="24"/>
-        </w:rPr>
-      </w:pPr>
-      <w:r>
-        <w:rPr>
-          <w:rFonts w:ascii="Times New Roman" w:hAnsi="Times New Roman" w:eastAsia="標楷體"/>
+          <w:rFonts w:ascii="Times New Roman" w:eastAsia="教育部標準楷書" w:hAnsi="Times New Roman" w:cs="教育部標準楷書"/>
+          <w:sz w:val="24"/>
+          <w:szCs w:val="24"/>
+        </w:rPr>
+      </w:pPr>
+      <w:r>
+        <w:rPr>
+          <w:rFonts w:ascii="Times New Roman" w:hAnsi="Times New Roman" w:eastAsia="教育部標準楷書"/>
           <w:b w:val="0"/>
           <w:sz w:val="24"/>
         </w:rPr>
@@ -687,14 +687,14 @@
         <w:ind w:left="724" w:hanging="57"/>
         <w:jc w:val="both"/>
         <w:rPr>
-          <w:rFonts w:ascii="標楷體" w:eastAsia="標楷體" w:hAnsi="標楷體" w:cs="標楷體"/>
-          <w:sz w:val="24"/>
-          <w:szCs w:val="24"/>
-        </w:rPr>
-      </w:pPr>
-      <w:r>
-        <w:rPr>
-          <w:rFonts w:ascii="Times New Roman" w:hAnsi="Times New Roman" w:eastAsia="標楷體"/>
+          <w:rFonts w:ascii="Times New Roman" w:eastAsia="教育部標準楷書" w:hAnsi="Times New Roman" w:cs="教育部標準楷書"/>
+          <w:sz w:val="24"/>
+          <w:szCs w:val="24"/>
+        </w:rPr>
+      </w:pPr>
+      <w:r>
+        <w:rPr>
+          <w:rFonts w:ascii="Times New Roman" w:hAnsi="Times New Roman" w:eastAsia="教育部標準楷書"/>
           <w:b w:val="0"/>
           <w:sz w:val="24"/>
         </w:rPr>
@@ -707,14 +707,14 @@
         <w:ind w:left="724" w:hanging="57"/>
         <w:jc w:val="both"/>
         <w:rPr>
-          <w:rFonts w:ascii="標楷體" w:eastAsia="標楷體" w:hAnsi="標楷體" w:cs="標楷體"/>
-          <w:sz w:val="24"/>
-          <w:szCs w:val="24"/>
-        </w:rPr>
-      </w:pPr>
-      <w:r>
-        <w:rPr>
-          <w:rFonts w:ascii="Times New Roman" w:hAnsi="Times New Roman" w:eastAsia="標楷體"/>
+          <w:rFonts w:ascii="Times New Roman" w:eastAsia="教育部標準楷書" w:hAnsi="Times New Roman" w:cs="教育部標準楷書"/>
+          <w:sz w:val="24"/>
+          <w:szCs w:val="24"/>
+        </w:rPr>
+      </w:pPr>
+      <w:r>
+        <w:rPr>
+          <w:rFonts w:ascii="Times New Roman" w:hAnsi="Times New Roman" w:eastAsia="教育部標準楷書"/>
           <w:b w:val="0"/>
           <w:sz w:val="24"/>
         </w:rPr>
@@ -727,7 +727,7 @@
         <w:ind w:left="724" w:hanging="57"/>
         <w:jc w:val="both"/>
         <w:rPr>
-          <w:rFonts w:ascii="標楷體" w:eastAsia="標楷體" w:hAnsi="標楷體" w:cs="標楷體"/>
+          <w:rFonts w:ascii="Times New Roman" w:eastAsia="教育部標準楷書" w:hAnsi="Times New Roman" w:cs="教育部標準楷書"/>
           <w:sz w:val="24"/>
           <w:szCs w:val="24"/>
         </w:rPr>
@@ -739,7 +739,7 @@
         <w:ind w:left="4" w:hanging="57"/>
         <w:jc w:val="both"/>
         <w:rPr>
-          <w:rFonts w:ascii="標楷體" w:eastAsia="標楷體" w:hAnsi="標楷體" w:cs="標楷體"/>
+          <w:rFonts w:ascii="Times New Roman" w:eastAsia="教育部標準楷書" w:hAnsi="Times New Roman" w:cs="教育部標準楷書"/>
           <w:b/>
           <w:bCs/>
           <w:sz w:val="36"/>
@@ -748,7 +748,7 @@
       </w:pPr>
       <w:r>
         <w:rPr>
-          <w:rFonts w:ascii="標楷體" w:eastAsia="標楷體" w:hAnsi="標楷體" w:cs="標楷體"/>
+          <w:rFonts w:ascii="Times New Roman" w:eastAsia="教育部標準楷書" w:hAnsi="Times New Roman" w:cs="教育部標準楷書"/>
           <w:b/>
           <w:bCs/>
           <w:sz w:val="36"/>
@@ -763,14 +763,14 @@
         <w:ind w:left="724" w:hanging="57"/>
         <w:jc w:val="both"/>
         <w:rPr>
-          <w:rFonts w:ascii="標楷體" w:eastAsia="標楷體" w:hAnsi="標楷體" w:cs="標楷體"/>
-          <w:sz w:val="24"/>
-          <w:szCs w:val="24"/>
-        </w:rPr>
-      </w:pPr>
-      <w:r>
-        <w:rPr>
-          <w:rFonts w:ascii="Times New Roman" w:hAnsi="Times New Roman" w:eastAsia="標楷體"/>
+          <w:rFonts w:ascii="Times New Roman" w:eastAsia="教育部標準楷書" w:hAnsi="Times New Roman" w:cs="教育部標準楷書"/>
+          <w:sz w:val="24"/>
+          <w:szCs w:val="24"/>
+        </w:rPr>
+      </w:pPr>
+      <w:r>
+        <w:rPr>
+          <w:rFonts w:ascii="Times New Roman" w:hAnsi="Times New Roman" w:eastAsia="教育部標準楷書"/>
           <w:b w:val="0"/>
           <w:sz w:val="24"/>
         </w:rPr>
@@ -783,14 +783,14 @@
         <w:ind w:left="724" w:hanging="57"/>
         <w:jc w:val="both"/>
         <w:rPr>
-          <w:rFonts w:ascii="標楷體" w:eastAsia="標楷體" w:hAnsi="標楷體" w:cs="標楷體"/>
-          <w:sz w:val="24"/>
-          <w:szCs w:val="24"/>
-        </w:rPr>
-      </w:pPr>
-      <w:r>
-        <w:rPr>
-          <w:rFonts w:ascii="Times New Roman" w:hAnsi="Times New Roman" w:eastAsia="標楷體"/>
+          <w:rFonts w:ascii="Times New Roman" w:eastAsia="教育部標準楷書" w:hAnsi="Times New Roman" w:cs="教育部標準楷書"/>
+          <w:sz w:val="24"/>
+          <w:szCs w:val="24"/>
+        </w:rPr>
+      </w:pPr>
+      <w:r>
+        <w:rPr>
+          <w:rFonts w:ascii="Times New Roman" w:hAnsi="Times New Roman" w:eastAsia="教育部標準楷書"/>
           <w:b w:val="0"/>
           <w:sz w:val="24"/>
         </w:rPr>
@@ -803,14 +803,14 @@
         <w:ind w:left="724" w:hanging="57"/>
         <w:jc w:val="both"/>
         <w:rPr>
-          <w:rFonts w:ascii="標楷體" w:eastAsia="標楷體" w:hAnsi="標楷體" w:cs="標楷體"/>
-          <w:sz w:val="24"/>
-          <w:szCs w:val="24"/>
-        </w:rPr>
-      </w:pPr>
-      <w:r>
-        <w:rPr>
-          <w:rFonts w:ascii="Times New Roman" w:hAnsi="Times New Roman" w:eastAsia="標楷體"/>
+          <w:rFonts w:ascii="Times New Roman" w:eastAsia="教育部標準楷書" w:hAnsi="Times New Roman" w:cs="教育部標準楷書"/>
+          <w:sz w:val="24"/>
+          <w:szCs w:val="24"/>
+        </w:rPr>
+      </w:pPr>
+      <w:r>
+        <w:rPr>
+          <w:rFonts w:ascii="Times New Roman" w:hAnsi="Times New Roman" w:eastAsia="教育部標準楷書"/>
           <w:b w:val="0"/>
           <w:sz w:val="24"/>
         </w:rPr>
@@ -823,14 +823,14 @@
         <w:ind w:left="724" w:hanging="57"/>
         <w:jc w:val="both"/>
         <w:rPr>
-          <w:rFonts w:ascii="標楷體" w:eastAsia="標楷體" w:hAnsi="標楷體" w:cs="標楷體"/>
-          <w:sz w:val="24"/>
-          <w:szCs w:val="24"/>
-        </w:rPr>
-      </w:pPr>
-      <w:r>
-        <w:rPr>
-          <w:rFonts w:ascii="Times New Roman" w:hAnsi="Times New Roman" w:eastAsia="標楷體"/>
+          <w:rFonts w:ascii="Times New Roman" w:eastAsia="教育部標準楷書" w:hAnsi="Times New Roman" w:cs="教育部標準楷書"/>
+          <w:sz w:val="24"/>
+          <w:szCs w:val="24"/>
+        </w:rPr>
+      </w:pPr>
+      <w:r>
+        <w:rPr>
+          <w:rFonts w:ascii="Times New Roman" w:hAnsi="Times New Roman" w:eastAsia="教育部標準楷書"/>
           <w:b w:val="0"/>
           <w:sz w:val="24"/>
         </w:rPr>
@@ -843,7 +843,7 @@
         <w:ind w:left="724" w:hanging="57"/>
         <w:jc w:val="both"/>
         <w:rPr>
-          <w:rFonts w:ascii="標楷體" w:eastAsia="標楷體" w:hAnsi="標楷體" w:cs="標楷體"/>
+          <w:rFonts w:ascii="Times New Roman" w:eastAsia="教育部標準楷書" w:hAnsi="Times New Roman" w:cs="教育部標準楷書"/>
           <w:sz w:val="24"/>
           <w:szCs w:val="24"/>
         </w:rPr>
@@ -855,7 +855,7 @@
         <w:ind w:left="4" w:hanging="57"/>
         <w:jc w:val="both"/>
         <w:rPr>
-          <w:rFonts w:ascii="標楷體" w:eastAsia="標楷體" w:hAnsi="標楷體" w:cs="標楷體"/>
+          <w:rFonts w:ascii="Times New Roman" w:eastAsia="教育部標準楷書" w:hAnsi="Times New Roman" w:cs="教育部標準楷書"/>
           <w:b/>
           <w:bCs/>
           <w:sz w:val="36"/>
@@ -864,7 +864,7 @@
       </w:pPr>
       <w:r>
         <w:rPr>
-          <w:rFonts w:ascii="標楷體" w:eastAsia="標楷體" w:hAnsi="標楷體" w:cs="標楷體"/>
+          <w:rFonts w:ascii="Times New Roman" w:eastAsia="教育部標準楷書" w:hAnsi="Times New Roman" w:cs="教育部標準楷書"/>
           <w:b/>
           <w:bCs/>
           <w:sz w:val="36"/>
@@ -879,14 +879,14 @@
         <w:ind w:left="724" w:hanging="57"/>
         <w:jc w:val="both"/>
         <w:rPr>
-          <w:rFonts w:ascii="標楷體" w:eastAsia="標楷體" w:hAnsi="標楷體" w:cs="標楷體"/>
-          <w:sz w:val="24"/>
-          <w:szCs w:val="24"/>
-        </w:rPr>
-      </w:pPr>
-      <w:r>
-        <w:rPr>
-          <w:rFonts w:ascii="Times New Roman" w:hAnsi="Times New Roman" w:eastAsia="標楷體"/>
+          <w:rFonts w:ascii="Times New Roman" w:eastAsia="教育部標準楷書" w:hAnsi="Times New Roman" w:cs="教育部標準楷書"/>
+          <w:sz w:val="24"/>
+          <w:szCs w:val="24"/>
+        </w:rPr>
+      </w:pPr>
+      <w:r>
+        <w:rPr>
+          <w:rFonts w:ascii="Times New Roman" w:hAnsi="Times New Roman" w:eastAsia="教育部標準楷書"/>
           <w:b w:val="0"/>
           <w:sz w:val="24"/>
         </w:rPr>
@@ -899,14 +899,14 @@
         <w:ind w:left="724" w:hanging="57"/>
         <w:jc w:val="both"/>
         <w:rPr>
-          <w:rFonts w:ascii="標楷體" w:eastAsia="標楷體" w:hAnsi="標楷體" w:cs="標楷體"/>
-          <w:sz w:val="24"/>
-          <w:szCs w:val="24"/>
-        </w:rPr>
-      </w:pPr>
-      <w:r>
-        <w:rPr>
-          <w:rFonts w:ascii="Times New Roman" w:hAnsi="Times New Roman" w:eastAsia="標楷體"/>
+          <w:rFonts w:ascii="Times New Roman" w:eastAsia="教育部標準楷書" w:hAnsi="Times New Roman" w:cs="教育部標準楷書"/>
+          <w:sz w:val="24"/>
+          <w:szCs w:val="24"/>
+        </w:rPr>
+      </w:pPr>
+      <w:r>
+        <w:rPr>
+          <w:rFonts w:ascii="Times New Roman" w:hAnsi="Times New Roman" w:eastAsia="教育部標準楷書"/>
           <w:b w:val="0"/>
           <w:sz w:val="24"/>
         </w:rPr>
@@ -919,14 +919,14 @@
         <w:ind w:left="724" w:hanging="57"/>
         <w:jc w:val="both"/>
         <w:rPr>
-          <w:rFonts w:ascii="標楷體" w:eastAsia="標楷體" w:hAnsi="標楷體" w:cs="標楷體"/>
-          <w:sz w:val="24"/>
-          <w:szCs w:val="24"/>
-        </w:rPr>
-      </w:pPr>
-      <w:r>
-        <w:rPr>
-          <w:rFonts w:ascii="Times New Roman" w:hAnsi="Times New Roman" w:eastAsia="標楷體"/>
+          <w:rFonts w:ascii="Times New Roman" w:eastAsia="教育部標準楷書" w:hAnsi="Times New Roman" w:cs="教育部標準楷書"/>
+          <w:sz w:val="24"/>
+          <w:szCs w:val="24"/>
+        </w:rPr>
+      </w:pPr>
+      <w:r>
+        <w:rPr>
+          <w:rFonts w:ascii="Times New Roman" w:hAnsi="Times New Roman" w:eastAsia="教育部標準楷書"/>
           <w:b w:val="0"/>
           <w:sz w:val="24"/>
         </w:rPr>
@@ -939,14 +939,14 @@
         <w:ind w:left="724" w:hanging="57"/>
         <w:jc w:val="both"/>
         <w:rPr>
-          <w:rFonts w:ascii="標楷體" w:eastAsia="標楷體" w:hAnsi="標楷體" w:cs="標楷體"/>
-          <w:sz w:val="24"/>
-          <w:szCs w:val="24"/>
-        </w:rPr>
-      </w:pPr>
-      <w:r>
-        <w:rPr>
-          <w:rFonts w:ascii="Times New Roman" w:hAnsi="Times New Roman" w:eastAsia="標楷體"/>
+          <w:rFonts w:ascii="Times New Roman" w:eastAsia="教育部標準楷書" w:hAnsi="Times New Roman" w:cs="教育部標準楷書"/>
+          <w:sz w:val="24"/>
+          <w:szCs w:val="24"/>
+        </w:rPr>
+      </w:pPr>
+      <w:r>
+        <w:rPr>
+          <w:rFonts w:ascii="Times New Roman" w:hAnsi="Times New Roman" w:eastAsia="教育部標準楷書"/>
           <w:b w:val="0"/>
           <w:sz w:val="24"/>
         </w:rPr>
@@ -959,14 +959,14 @@
         <w:ind w:left="724" w:hanging="57"/>
         <w:jc w:val="both"/>
         <w:rPr>
-          <w:rFonts w:ascii="標楷體" w:eastAsia="標楷體" w:hAnsi="標楷體" w:cs="標楷體"/>
-          <w:sz w:val="24"/>
-          <w:szCs w:val="24"/>
-        </w:rPr>
-      </w:pPr>
-      <w:r>
-        <w:rPr>
-          <w:rFonts w:ascii="Times New Roman" w:hAnsi="Times New Roman" w:eastAsia="標楷體"/>
+          <w:rFonts w:ascii="Times New Roman" w:eastAsia="教育部標準楷書" w:hAnsi="Times New Roman" w:cs="教育部標準楷書"/>
+          <w:sz w:val="24"/>
+          <w:szCs w:val="24"/>
+        </w:rPr>
+      </w:pPr>
+      <w:r>
+        <w:rPr>
+          <w:rFonts w:ascii="Times New Roman" w:hAnsi="Times New Roman" w:eastAsia="教育部標準楷書"/>
           <w:b w:val="0"/>
           <w:sz w:val="24"/>
         </w:rPr>
@@ -979,7 +979,7 @@
         <w:ind w:left="-53"/>
         <w:jc w:val="both"/>
         <w:rPr>
-          <w:rFonts w:ascii="標楷體" w:eastAsia="標楷體" w:hAnsi="標楷體" w:cs="標楷體"/>
+          <w:rFonts w:ascii="Times New Roman" w:eastAsia="教育部標準楷書" w:hAnsi="Times New Roman" w:cs="教育部標準楷書"/>
           <w:sz w:val="36"/>
           <w:szCs w:val="36"/>
         </w:rPr>
@@ -991,7 +991,7 @@
         <w:ind w:left="4" w:hanging="57"/>
         <w:jc w:val="both"/>
         <w:rPr>
-          <w:rFonts w:ascii="標楷體" w:eastAsia="標楷體" w:hAnsi="標楷體" w:cs="標楷體"/>
+          <w:rFonts w:ascii="Times New Roman" w:eastAsia="教育部標準楷書" w:hAnsi="Times New Roman" w:cs="教育部標準楷書"/>
           <w:b/>
           <w:bCs/>
           <w:sz w:val="36"/>
@@ -1000,7 +1000,7 @@
       </w:pPr>
       <w:r>
         <w:rPr>
-          <w:rFonts w:ascii="標楷體" w:eastAsia="標楷體" w:hAnsi="標楷體" w:cs="標楷體"/>
+          <w:rFonts w:ascii="Times New Roman" w:eastAsia="教育部標準楷書" w:hAnsi="Times New Roman" w:cs="教育部標準楷書"/>
           <w:b/>
           <w:bCs/>
           <w:sz w:val="36"/>
@@ -1015,14 +1015,14 @@
         <w:ind w:left="724" w:hanging="57"/>
         <w:jc w:val="both"/>
         <w:rPr>
-          <w:rFonts w:ascii="標楷體" w:eastAsia="標楷體" w:hAnsi="標楷體" w:cs="標楷體"/>
-          <w:sz w:val="24"/>
-          <w:szCs w:val="24"/>
-        </w:rPr>
-      </w:pPr>
-      <w:r>
-        <w:rPr>
-          <w:rFonts w:ascii="Times New Roman" w:hAnsi="Times New Roman" w:eastAsia="標楷體"/>
+          <w:rFonts w:ascii="Times New Roman" w:eastAsia="教育部標準楷書" w:hAnsi="Times New Roman" w:cs="教育部標準楷書"/>
+          <w:sz w:val="24"/>
+          <w:szCs w:val="24"/>
+        </w:rPr>
+      </w:pPr>
+      <w:r>
+        <w:rPr>
+          <w:rFonts w:ascii="Times New Roman" w:hAnsi="Times New Roman" w:eastAsia="教育部標準楷書"/>
           <w:b w:val="0"/>
           <w:sz w:val="24"/>
         </w:rPr>
@@ -1035,14 +1035,14 @@
         <w:ind w:left="724" w:hanging="57"/>
         <w:jc w:val="both"/>
         <w:rPr>
-          <w:rFonts w:ascii="標楷體" w:eastAsia="標楷體" w:hAnsi="標楷體" w:cs="標楷體"/>
-          <w:sz w:val="24"/>
-          <w:szCs w:val="24"/>
-        </w:rPr>
-      </w:pPr>
-      <w:r>
-        <w:rPr>
-          <w:rFonts w:ascii="Times New Roman" w:hAnsi="Times New Roman" w:eastAsia="標楷體"/>
+          <w:rFonts w:ascii="Times New Roman" w:eastAsia="教育部標準楷書" w:hAnsi="Times New Roman" w:cs="教育部標準楷書"/>
+          <w:sz w:val="24"/>
+          <w:szCs w:val="24"/>
+        </w:rPr>
+      </w:pPr>
+      <w:r>
+        <w:rPr>
+          <w:rFonts w:ascii="Times New Roman" w:hAnsi="Times New Roman" w:eastAsia="教育部標準楷書"/>
           <w:b w:val="0"/>
           <w:sz w:val="24"/>
         </w:rPr>
@@ -1055,14 +1055,14 @@
         <w:ind w:left="724" w:hanging="57"/>
         <w:jc w:val="both"/>
         <w:rPr>
-          <w:rFonts w:ascii="標楷體" w:eastAsia="標楷體" w:hAnsi="標楷體" w:cs="標楷體"/>
-          <w:sz w:val="24"/>
-          <w:szCs w:val="24"/>
-        </w:rPr>
-      </w:pPr>
-      <w:r>
-        <w:rPr>
-          <w:rFonts w:ascii="Times New Roman" w:hAnsi="Times New Roman" w:eastAsia="標楷體"/>
+          <w:rFonts w:ascii="Times New Roman" w:eastAsia="教育部標準楷書" w:hAnsi="Times New Roman" w:cs="教育部標準楷書"/>
+          <w:sz w:val="24"/>
+          <w:szCs w:val="24"/>
+        </w:rPr>
+      </w:pPr>
+      <w:r>
+        <w:rPr>
+          <w:rFonts w:ascii="Times New Roman" w:hAnsi="Times New Roman" w:eastAsia="教育部標準楷書"/>
           <w:b w:val="0"/>
           <w:sz w:val="24"/>
         </w:rPr>
@@ -1075,14 +1075,14 @@
         <w:ind w:left="724" w:hanging="57"/>
         <w:jc w:val="both"/>
         <w:rPr>
-          <w:rFonts w:ascii="標楷體" w:eastAsia="標楷體" w:hAnsi="標楷體" w:cs="標楷體"/>
-          <w:sz w:val="24"/>
-          <w:szCs w:val="24"/>
-        </w:rPr>
-      </w:pPr>
-      <w:r>
-        <w:rPr>
-          <w:rFonts w:ascii="Times New Roman" w:hAnsi="Times New Roman" w:eastAsia="標楷體"/>
+          <w:rFonts w:ascii="Times New Roman" w:eastAsia="教育部標準楷書" w:hAnsi="Times New Roman" w:cs="教育部標準楷書"/>
+          <w:sz w:val="24"/>
+          <w:szCs w:val="24"/>
+        </w:rPr>
+      </w:pPr>
+      <w:r>
+        <w:rPr>
+          <w:rFonts w:ascii="Times New Roman" w:hAnsi="Times New Roman" w:eastAsia="教育部標準楷書"/>
           <w:b w:val="0"/>
           <w:sz w:val="24"/>
         </w:rPr>
@@ -1095,14 +1095,14 @@
         <w:ind w:left="724" w:hanging="57"/>
         <w:jc w:val="both"/>
         <w:rPr>
-          <w:rFonts w:ascii="標楷體" w:eastAsia="標楷體" w:hAnsi="標楷體" w:cs="標楷體"/>
-          <w:sz w:val="24"/>
-          <w:szCs w:val="24"/>
-        </w:rPr>
-      </w:pPr>
-      <w:r>
-        <w:rPr>
-          <w:rFonts w:ascii="Times New Roman" w:hAnsi="Times New Roman" w:eastAsia="標楷體"/>
+          <w:rFonts w:ascii="Times New Roman" w:eastAsia="教育部標準楷書" w:hAnsi="Times New Roman" w:cs="教育部標準楷書"/>
+          <w:sz w:val="24"/>
+          <w:szCs w:val="24"/>
+        </w:rPr>
+      </w:pPr>
+      <w:r>
+        <w:rPr>
+          <w:rFonts w:ascii="Times New Roman" w:hAnsi="Times New Roman" w:eastAsia="教育部標準楷書"/>
           <w:b w:val="0"/>
           <w:sz w:val="24"/>
         </w:rPr>
@@ -1115,7 +1115,7 @@
         <w:ind w:left="724" w:hanging="57"/>
         <w:jc w:val="both"/>
         <w:rPr>
-          <w:rFonts w:ascii="標楷體" w:eastAsia="標楷體" w:hAnsi="標楷體" w:cs="標楷體"/>
+          <w:rFonts w:ascii="Times New Roman" w:eastAsia="教育部標準楷書" w:hAnsi="Times New Roman" w:cs="教育部標準楷書"/>
           <w:sz w:val="24"/>
           <w:szCs w:val="24"/>
         </w:rPr>
@@ -1127,7 +1127,7 @@
         <w:ind w:left="-53"/>
         <w:jc w:val="both"/>
         <w:rPr>
-          <w:rFonts w:ascii="標楷體" w:eastAsia="標楷體" w:hAnsi="標楷體" w:cs="標楷體"/>
+          <w:rFonts w:ascii="Times New Roman" w:eastAsia="教育部標準楷書" w:hAnsi="Times New Roman" w:cs="教育部標準楷書"/>
           <w:b/>
           <w:bCs/>
           <w:sz w:val="36"/>
@@ -1136,7 +1136,7 @@
       </w:pPr>
       <w:r>
         <w:rPr>
-          <w:rFonts w:ascii="標楷體" w:eastAsia="標楷體" w:hAnsi="標楷體" w:cs="標楷體"/>
+          <w:rFonts w:ascii="Times New Roman" w:eastAsia="教育部標準楷書" w:hAnsi="Times New Roman" w:cs="教育部標準楷書"/>
           <w:b/>
           <w:bCs/>
           <w:sz w:val="36"/>
@@ -1151,14 +1151,14 @@
         <w:ind w:left="724" w:hanging="57"/>
         <w:jc w:val="both"/>
         <w:rPr>
-          <w:rFonts w:ascii="標楷體" w:eastAsia="標楷體" w:hAnsi="標楷體" w:cs="標楷體"/>
-          <w:sz w:val="24"/>
-          <w:szCs w:val="24"/>
-        </w:rPr>
-      </w:pPr>
-      <w:r>
-        <w:rPr>
-          <w:rFonts w:ascii="Times New Roman" w:hAnsi="Times New Roman" w:eastAsia="標楷體"/>
+          <w:rFonts w:ascii="Times New Roman" w:eastAsia="教育部標準楷書" w:hAnsi="Times New Roman" w:cs="教育部標準楷書"/>
+          <w:sz w:val="24"/>
+          <w:szCs w:val="24"/>
+        </w:rPr>
+      </w:pPr>
+      <w:r>
+        <w:rPr>
+          <w:rFonts w:ascii="Times New Roman" w:hAnsi="Times New Roman" w:eastAsia="教育部標準楷書"/>
           <w:b w:val="0"/>
           <w:sz w:val="24"/>
         </w:rPr>
@@ -1171,14 +1171,14 @@
         <w:ind w:left="724" w:hanging="57"/>
         <w:jc w:val="both"/>
         <w:rPr>
-          <w:rFonts w:ascii="標楷體" w:eastAsia="標楷體" w:hAnsi="標楷體" w:cs="標楷體"/>
-          <w:sz w:val="24"/>
-          <w:szCs w:val="24"/>
-        </w:rPr>
-      </w:pPr>
-      <w:r>
-        <w:rPr>
-          <w:rFonts w:ascii="Times New Roman" w:hAnsi="Times New Roman" w:eastAsia="標楷體"/>
+          <w:rFonts w:ascii="Times New Roman" w:eastAsia="教育部標準楷書" w:hAnsi="Times New Roman" w:cs="教育部標準楷書"/>
+          <w:sz w:val="24"/>
+          <w:szCs w:val="24"/>
+        </w:rPr>
+      </w:pPr>
+      <w:r>
+        <w:rPr>
+          <w:rFonts w:ascii="Times New Roman" w:hAnsi="Times New Roman" w:eastAsia="教育部標準楷書"/>
           <w:b w:val="0"/>
           <w:sz w:val="24"/>
         </w:rPr>
@@ -1191,14 +1191,14 @@
         <w:ind w:left="724" w:hanging="57"/>
         <w:jc w:val="both"/>
         <w:rPr>
-          <w:rFonts w:ascii="標楷體" w:eastAsia="標楷體" w:hAnsi="標楷體" w:cs="標楷體"/>
-          <w:sz w:val="24"/>
-          <w:szCs w:val="24"/>
-        </w:rPr>
-      </w:pPr>
-      <w:r>
-        <w:rPr>
-          <w:rFonts w:ascii="Times New Roman" w:hAnsi="Times New Roman" w:eastAsia="標楷體"/>
+          <w:rFonts w:ascii="Times New Roman" w:eastAsia="教育部標準楷書" w:hAnsi="Times New Roman" w:cs="教育部標準楷書"/>
+          <w:sz w:val="24"/>
+          <w:szCs w:val="24"/>
+        </w:rPr>
+      </w:pPr>
+      <w:r>
+        <w:rPr>
+          <w:rFonts w:ascii="Times New Roman" w:hAnsi="Times New Roman" w:eastAsia="教育部標準楷書"/>
           <w:b w:val="0"/>
           <w:sz w:val="24"/>
         </w:rPr>
@@ -1211,14 +1211,14 @@
         <w:ind w:left="724" w:hanging="57"/>
         <w:jc w:val="both"/>
         <w:rPr>
-          <w:rFonts w:ascii="標楷體" w:eastAsia="標楷體" w:hAnsi="標楷體" w:cs="標楷體"/>
-          <w:sz w:val="24"/>
-          <w:szCs w:val="24"/>
-        </w:rPr>
-      </w:pPr>
-      <w:r>
-        <w:rPr>
-          <w:rFonts w:ascii="Times New Roman" w:hAnsi="Times New Roman" w:eastAsia="標楷體"/>
+          <w:rFonts w:ascii="Times New Roman" w:eastAsia="教育部標準楷書" w:hAnsi="Times New Roman" w:cs="教育部標準楷書"/>
+          <w:sz w:val="24"/>
+          <w:szCs w:val="24"/>
+        </w:rPr>
+      </w:pPr>
+      <w:r>
+        <w:rPr>
+          <w:rFonts w:ascii="Times New Roman" w:hAnsi="Times New Roman" w:eastAsia="教育部標準楷書"/>
           <w:b w:val="0"/>
           <w:sz w:val="24"/>
         </w:rPr>
@@ -1231,14 +1231,14 @@
         <w:ind w:left="724" w:hanging="57"/>
         <w:jc w:val="both"/>
         <w:rPr>
-          <w:rFonts w:ascii="標楷體" w:eastAsia="標楷體" w:hAnsi="標楷體" w:cs="標楷體"/>
-          <w:sz w:val="24"/>
-          <w:szCs w:val="24"/>
-        </w:rPr>
-      </w:pPr>
-      <w:r>
-        <w:rPr>
-          <w:rFonts w:ascii="Times New Roman" w:hAnsi="Times New Roman" w:eastAsia="標楷體"/>
+          <w:rFonts w:ascii="Times New Roman" w:eastAsia="教育部標準楷書" w:hAnsi="Times New Roman" w:cs="教育部標準楷書"/>
+          <w:sz w:val="24"/>
+          <w:szCs w:val="24"/>
+        </w:rPr>
+      </w:pPr>
+      <w:r>
+        <w:rPr>
+          <w:rFonts w:ascii="Times New Roman" w:hAnsi="Times New Roman" w:eastAsia="教育部標準楷書"/>
           <w:b w:val="0"/>
           <w:sz w:val="24"/>
         </w:rPr>
@@ -1251,14 +1251,14 @@
         <w:ind w:left="724" w:hanging="57"/>
         <w:jc w:val="both"/>
         <w:rPr>
-          <w:rFonts w:ascii="標楷體" w:eastAsia="標楷體" w:hAnsi="標楷體" w:cs="標楷體"/>
-          <w:sz w:val="24"/>
-          <w:szCs w:val="24"/>
-        </w:rPr>
-      </w:pPr>
-      <w:r>
-        <w:rPr>
-          <w:rFonts w:ascii="Times New Roman" w:hAnsi="Times New Roman" w:eastAsia="標楷體"/>
+          <w:rFonts w:ascii="Times New Roman" w:eastAsia="教育部標準楷書" w:hAnsi="Times New Roman" w:cs="教育部標準楷書"/>
+          <w:sz w:val="24"/>
+          <w:szCs w:val="24"/>
+        </w:rPr>
+      </w:pPr>
+      <w:r>
+        <w:rPr>
+          <w:rFonts w:ascii="Times New Roman" w:hAnsi="Times New Roman" w:eastAsia="教育部標準楷書"/>
           <w:b w:val="0"/>
           <w:sz w:val="24"/>
         </w:rPr>
@@ -1271,7 +1271,7 @@
         <w:ind w:left="724" w:hanging="57"/>
         <w:jc w:val="both"/>
         <w:rPr>
-          <w:rFonts w:ascii="標楷體" w:eastAsia="標楷體" w:hAnsi="標楷體" w:cs="標楷體"/>
+          <w:rFonts w:ascii="Times New Roman" w:eastAsia="教育部標準楷書" w:hAnsi="Times New Roman" w:cs="教育部標準楷書"/>
           <w:sz w:val="24"/>
           <w:szCs w:val="24"/>
         </w:rPr>
@@ -1283,7 +1283,7 @@
         <w:ind w:left="4" w:hanging="57"/>
         <w:jc w:val="both"/>
         <w:rPr>
-          <w:rFonts w:ascii="標楷體" w:eastAsia="標楷體" w:hAnsi="標楷體" w:cs="標楷體"/>
+          <w:rFonts w:ascii="Times New Roman" w:eastAsia="教育部標準楷書" w:hAnsi="Times New Roman" w:cs="教育部標準楷書"/>
           <w:b/>
           <w:bCs/>
           <w:sz w:val="36"/>
@@ -1293,7 +1293,7 @@
       <w:proofErr w:type="gramStart"/>
       <w:r>
         <w:rPr>
-          <w:rFonts w:ascii="標楷體" w:eastAsia="標楷體" w:hAnsi="標楷體" w:cs="標楷體"/>
+          <w:rFonts w:ascii="Times New Roman" w:eastAsia="教育部標準楷書" w:hAnsi="Times New Roman" w:cs="教育部標準楷書"/>
           <w:b/>
           <w:bCs/>
           <w:sz w:val="36"/>
@@ -1305,7 +1305,7 @@
       <w:proofErr w:type="gramEnd"/>
       <w:r>
         <w:rPr>
-          <w:rFonts w:ascii="標楷體" w:eastAsia="標楷體" w:hAnsi="標楷體" w:cs="標楷體"/>
+          <w:rFonts w:ascii="Times New Roman" w:eastAsia="教育部標準楷書" w:hAnsi="Times New Roman" w:cs="教育部標準楷書"/>
           <w:b/>
           <w:bCs/>
           <w:sz w:val="36"/>
@@ -1320,14 +1320,14 @@
         <w:ind w:left="724" w:hanging="57"/>
         <w:jc w:val="both"/>
         <w:rPr>
-          <w:rFonts w:ascii="標楷體" w:eastAsia="標楷體" w:hAnsi="標楷體" w:cs="標楷體"/>
-          <w:sz w:val="24"/>
-          <w:szCs w:val="24"/>
-        </w:rPr>
-      </w:pPr>
-      <w:r>
-        <w:rPr>
-          <w:rFonts w:ascii="Times New Roman" w:hAnsi="Times New Roman" w:eastAsia="標楷體"/>
+          <w:rFonts w:ascii="Times New Roman" w:eastAsia="教育部標準楷書" w:hAnsi="Times New Roman" w:cs="教育部標準楷書"/>
+          <w:sz w:val="24"/>
+          <w:szCs w:val="24"/>
+        </w:rPr>
+      </w:pPr>
+      <w:r>
+        <w:rPr>
+          <w:rFonts w:ascii="Times New Roman" w:hAnsi="Times New Roman" w:eastAsia="教育部標準楷書"/>
           <w:b w:val="0"/>
           <w:sz w:val="24"/>
         </w:rPr>
@@ -1340,14 +1340,14 @@
         <w:ind w:left="724" w:hanging="57"/>
         <w:jc w:val="both"/>
         <w:rPr>
-          <w:rFonts w:ascii="標楷體" w:eastAsia="標楷體" w:hAnsi="標楷體" w:cs="標楷體"/>
-          <w:sz w:val="24"/>
-          <w:szCs w:val="24"/>
-        </w:rPr>
-      </w:pPr>
-      <w:r>
-        <w:rPr>
-          <w:rFonts w:ascii="Times New Roman" w:hAnsi="Times New Roman" w:eastAsia="標楷體"/>
+          <w:rFonts w:ascii="Times New Roman" w:eastAsia="教育部標準楷書" w:hAnsi="Times New Roman" w:cs="教育部標準楷書"/>
+          <w:sz w:val="24"/>
+          <w:szCs w:val="24"/>
+        </w:rPr>
+      </w:pPr>
+      <w:r>
+        <w:rPr>
+          <w:rFonts w:ascii="Times New Roman" w:hAnsi="Times New Roman" w:eastAsia="教育部標準楷書"/>
           <w:b w:val="0"/>
           <w:sz w:val="24"/>
         </w:rPr>
@@ -1360,7 +1360,7 @@
         <w:ind w:left="724" w:hanging="57"/>
         <w:jc w:val="both"/>
         <w:rPr>
-          <w:rFonts w:ascii="標楷體" w:eastAsia="標楷體" w:hAnsi="標楷體" w:cs="標楷體"/>
+          <w:rFonts w:ascii="Times New Roman" w:eastAsia="教育部標準楷書" w:hAnsi="Times New Roman" w:cs="教育部標準楷書"/>
           <w:sz w:val="24"/>
           <w:szCs w:val="24"/>
         </w:rPr>
@@ -1372,7 +1372,7 @@
         <w:ind w:left="4" w:hanging="57"/>
         <w:jc w:val="both"/>
         <w:rPr>
-          <w:rFonts w:ascii="標楷體" w:eastAsia="標楷體" w:hAnsi="標楷體" w:cs="標楷體" w:hint="eastAsia"/>
+          <w:rFonts w:ascii="Times New Roman" w:eastAsia="教育部標準楷書" w:hAnsi="Times New Roman" w:cs="教育部標準楷書" w:hint="eastAsia"/>
           <w:b/>
           <w:bCs/>
           <w:sz w:val="36"/>
@@ -1381,7 +1381,7 @@
       </w:pPr>
       <w:r>
         <w:rPr>
-          <w:rFonts w:ascii="標楷體" w:eastAsia="標楷體" w:hAnsi="標楷體" w:cs="標楷體"/>
+          <w:rFonts w:ascii="Times New Roman" w:eastAsia="教育部標準楷書" w:hAnsi="Times New Roman" w:cs="教育部標準楷書"/>
           <w:b/>
           <w:bCs/>
           <w:sz w:val="36"/>
@@ -1396,14 +1396,14 @@
         <w:ind w:left="724" w:hanging="57"/>
         <w:jc w:val="both"/>
         <w:rPr>
-          <w:rFonts w:ascii="標楷體" w:eastAsia="標楷體" w:hAnsi="標楷體" w:cs="標楷體"/>
-          <w:sz w:val="24"/>
-          <w:szCs w:val="24"/>
-        </w:rPr>
-      </w:pPr>
-      <w:r>
-        <w:rPr>
-          <w:rFonts w:ascii="Times New Roman" w:hAnsi="Times New Roman" w:eastAsia="標楷體"/>
+          <w:rFonts w:ascii="Times New Roman" w:eastAsia="教育部標準楷書" w:hAnsi="Times New Roman" w:cs="教育部標準楷書"/>
+          <w:sz w:val="24"/>
+          <w:szCs w:val="24"/>
+        </w:rPr>
+      </w:pPr>
+      <w:r>
+        <w:rPr>
+          <w:rFonts w:ascii="Times New Roman" w:hAnsi="Times New Roman" w:eastAsia="教育部標準楷書"/>
           <w:b w:val="0"/>
           <w:sz w:val="24"/>
         </w:rPr>
@@ -1416,14 +1416,14 @@
         <w:ind w:left="724" w:hanging="57"/>
         <w:jc w:val="both"/>
         <w:rPr>
-          <w:rFonts w:ascii="標楷體" w:eastAsia="標楷體" w:hAnsi="標楷體" w:cs="標楷體"/>
-          <w:sz w:val="24"/>
-          <w:szCs w:val="24"/>
-        </w:rPr>
-      </w:pPr>
-      <w:r>
-        <w:rPr>
-          <w:rFonts w:ascii="Times New Roman" w:hAnsi="Times New Roman" w:eastAsia="標楷體"/>
+          <w:rFonts w:ascii="Times New Roman" w:eastAsia="教育部標準楷書" w:hAnsi="Times New Roman" w:cs="教育部標準楷書"/>
+          <w:sz w:val="24"/>
+          <w:szCs w:val="24"/>
+        </w:rPr>
+      </w:pPr>
+      <w:r>
+        <w:rPr>
+          <w:rFonts w:ascii="Times New Roman" w:hAnsi="Times New Roman" w:eastAsia="教育部標準楷書"/>
           <w:b w:val="0"/>
           <w:sz w:val="24"/>
         </w:rPr>
@@ -1436,14 +1436,14 @@
         <w:ind w:left="420" w:hanging="420"/>
         <w:jc w:val="both"/>
         <w:rPr>
-          <w:rFonts w:ascii="標楷體" w:eastAsia="標楷體" w:hAnsi="標楷體" w:cs="標楷體"/>
-          <w:sz w:val="24"/>
-          <w:szCs w:val="24"/>
-        </w:rPr>
-      </w:pPr>
-      <w:r>
-        <w:rPr>
-          <w:rFonts w:ascii="Times New Roman" w:hAnsi="Times New Roman" w:eastAsia="標楷體"/>
+          <w:rFonts w:ascii="Times New Roman" w:eastAsia="教育部標準楷書" w:hAnsi="Times New Roman" w:cs="教育部標準楷書"/>
+          <w:sz w:val="24"/>
+          <w:szCs w:val="24"/>
+        </w:rPr>
+      </w:pPr>
+      <w:r>
+        <w:rPr>
+          <w:rFonts w:ascii="Times New Roman" w:hAnsi="Times New Roman" w:eastAsia="教育部標準楷書"/>
           <w:b w:val="0"/>
           <w:sz w:val="24"/>
         </w:rPr>
@@ -1456,14 +1456,14 @@
         <w:ind w:left="420" w:hanging="420"/>
         <w:jc w:val="both"/>
         <w:rPr>
-          <w:rFonts w:ascii="標楷體" w:eastAsia="標楷體" w:hAnsi="標楷體" w:cs="標楷體"/>
-          <w:sz w:val="24"/>
-          <w:szCs w:val="24"/>
-        </w:rPr>
-      </w:pPr>
-      <w:r>
-        <w:rPr>
-          <w:rFonts w:ascii="Times New Roman" w:hAnsi="Times New Roman" w:eastAsia="標楷體"/>
+          <w:rFonts w:ascii="Times New Roman" w:eastAsia="教育部標準楷書" w:hAnsi="Times New Roman" w:cs="教育部標準楷書"/>
+          <w:sz w:val="24"/>
+          <w:szCs w:val="24"/>
+        </w:rPr>
+      </w:pPr>
+      <w:r>
+        <w:rPr>
+          <w:rFonts w:ascii="Times New Roman" w:hAnsi="Times New Roman" w:eastAsia="教育部標準楷書"/>
           <w:b w:val="0"/>
           <w:sz w:val="24"/>
         </w:rPr>
@@ -1476,14 +1476,14 @@
         <w:ind w:left="420" w:hanging="420"/>
         <w:jc w:val="both"/>
         <w:rPr>
-          <w:rFonts w:ascii="標楷體" w:eastAsia="標楷體" w:hAnsi="標楷體" w:cs="標楷體"/>
-          <w:sz w:val="24"/>
-          <w:szCs w:val="24"/>
-        </w:rPr>
-      </w:pPr>
-      <w:r>
-        <w:rPr>
-          <w:rFonts w:ascii="Times New Roman" w:hAnsi="Times New Roman" w:eastAsia="標楷體"/>
+          <w:rFonts w:ascii="Times New Roman" w:eastAsia="教育部標準楷書" w:hAnsi="Times New Roman" w:cs="教育部標準楷書"/>
+          <w:sz w:val="24"/>
+          <w:szCs w:val="24"/>
+        </w:rPr>
+      </w:pPr>
+      <w:r>
+        <w:rPr>
+          <w:rFonts w:ascii="Times New Roman" w:hAnsi="Times New Roman" w:eastAsia="教育部標準楷書"/>
           <w:b w:val="0"/>
           <w:sz w:val="24"/>
         </w:rPr>
@@ -1496,14 +1496,14 @@
         <w:ind w:left="420" w:hanging="420"/>
         <w:jc w:val="both"/>
         <w:rPr>
-          <w:rFonts w:ascii="標楷體" w:eastAsia="標楷體" w:hAnsi="標楷體" w:cs="標楷體"/>
-          <w:sz w:val="24"/>
-          <w:szCs w:val="24"/>
-        </w:rPr>
-      </w:pPr>
-      <w:r>
-        <w:rPr>
-          <w:rFonts w:ascii="Times New Roman" w:hAnsi="Times New Roman" w:eastAsia="標楷體"/>
+          <w:rFonts w:ascii="Times New Roman" w:eastAsia="教育部標準楷書" w:hAnsi="Times New Roman" w:cs="教育部標準楷書"/>
+          <w:sz w:val="24"/>
+          <w:szCs w:val="24"/>
+        </w:rPr>
+      </w:pPr>
+      <w:r>
+        <w:rPr>
+          <w:rFonts w:ascii="Times New Roman" w:hAnsi="Times New Roman" w:eastAsia="教育部標準楷書"/>
           <w:b w:val="0"/>
           <w:sz w:val="24"/>
         </w:rPr>
@@ -1516,14 +1516,14 @@
         <w:ind w:left="420" w:hanging="420"/>
         <w:jc w:val="both"/>
         <w:rPr>
-          <w:rFonts w:ascii="標楷體" w:eastAsia="標楷體" w:hAnsi="標楷體" w:cs="標楷體"/>
-          <w:sz w:val="24"/>
-          <w:szCs w:val="24"/>
-        </w:rPr>
-      </w:pPr>
-      <w:r>
-        <w:rPr>
-          <w:rFonts w:ascii="Times New Roman" w:hAnsi="Times New Roman" w:eastAsia="標楷體"/>
+          <w:rFonts w:ascii="Times New Roman" w:eastAsia="教育部標準楷書" w:hAnsi="Times New Roman" w:cs="教育部標準楷書"/>
+          <w:sz w:val="24"/>
+          <w:szCs w:val="24"/>
+        </w:rPr>
+      </w:pPr>
+      <w:r>
+        <w:rPr>
+          <w:rFonts w:ascii="Times New Roman" w:hAnsi="Times New Roman" w:eastAsia="教育部標準楷書"/>
           <w:b w:val="0"/>
           <w:sz w:val="24"/>
         </w:rPr>
@@ -1536,14 +1536,14 @@
         <w:ind w:left="420" w:hanging="420"/>
         <w:jc w:val="both"/>
         <w:rPr>
-          <w:rFonts w:ascii="標楷體" w:eastAsia="標楷體" w:hAnsi="標楷體" w:cs="標楷體"/>
-          <w:sz w:val="24"/>
-          <w:szCs w:val="24"/>
-        </w:rPr>
-      </w:pPr>
-      <w:r>
-        <w:rPr>
-          <w:rFonts w:ascii="Times New Roman" w:hAnsi="Times New Roman" w:eastAsia="標楷體"/>
+          <w:rFonts w:ascii="Times New Roman" w:eastAsia="教育部標準楷書" w:hAnsi="Times New Roman" w:cs="教育部標準楷書"/>
+          <w:sz w:val="24"/>
+          <w:szCs w:val="24"/>
+        </w:rPr>
+      </w:pPr>
+      <w:r>
+        <w:rPr>
+          <w:rFonts w:ascii="Times New Roman" w:hAnsi="Times New Roman" w:eastAsia="教育部標準楷書"/>
           <w:b w:val="0"/>
           <w:sz w:val="24"/>
         </w:rPr>
@@ -1556,14 +1556,14 @@
         <w:ind w:left="420" w:hanging="420"/>
         <w:jc w:val="both"/>
         <w:rPr>
-          <w:rFonts w:ascii="標楷體" w:eastAsia="標楷體" w:hAnsi="標楷體" w:cs="標楷體"/>
-          <w:sz w:val="24"/>
-          <w:szCs w:val="24"/>
-        </w:rPr>
-      </w:pPr>
-      <w:r>
-        <w:rPr>
-          <w:rFonts w:ascii="Times New Roman" w:hAnsi="Times New Roman" w:eastAsia="標楷體"/>
+          <w:rFonts w:ascii="Times New Roman" w:eastAsia="教育部標準楷書" w:hAnsi="Times New Roman" w:cs="教育部標準楷書"/>
+          <w:sz w:val="24"/>
+          <w:szCs w:val="24"/>
+        </w:rPr>
+      </w:pPr>
+      <w:r>
+        <w:rPr>
+          <w:rFonts w:ascii="Times New Roman" w:hAnsi="Times New Roman" w:eastAsia="教育部標準楷書"/>
           <w:b w:val="0"/>
           <w:sz w:val="24"/>
         </w:rPr>
@@ -1576,14 +1576,14 @@
         <w:ind w:left="420" w:hanging="420"/>
         <w:jc w:val="both"/>
         <w:rPr>
-          <w:rFonts w:ascii="標楷體" w:eastAsia="標楷體" w:hAnsi="標楷體" w:cs="標楷體"/>
-          <w:sz w:val="24"/>
-          <w:szCs w:val="24"/>
-        </w:rPr>
-      </w:pPr>
-      <w:r>
-        <w:rPr>
-          <w:rFonts w:ascii="Times New Roman" w:hAnsi="Times New Roman" w:eastAsia="標楷體"/>
+          <w:rFonts w:ascii="Times New Roman" w:eastAsia="教育部標準楷書" w:hAnsi="Times New Roman" w:cs="教育部標準楷書"/>
+          <w:sz w:val="24"/>
+          <w:szCs w:val="24"/>
+        </w:rPr>
+      </w:pPr>
+      <w:r>
+        <w:rPr>
+          <w:rFonts w:ascii="Times New Roman" w:hAnsi="Times New Roman" w:eastAsia="教育部標準楷書"/>
           <w:b w:val="0"/>
           <w:sz w:val="24"/>
         </w:rPr>
@@ -1596,14 +1596,14 @@
         <w:ind w:left="420" w:hanging="420"/>
         <w:jc w:val="both"/>
         <w:rPr>
-          <w:rFonts w:ascii="標楷體" w:eastAsia="標楷體" w:hAnsi="標楷體" w:cs="標楷體"/>
-          <w:sz w:val="24"/>
-          <w:szCs w:val="24"/>
-        </w:rPr>
-      </w:pPr>
-      <w:r>
-        <w:rPr>
-          <w:rFonts w:ascii="Times New Roman" w:hAnsi="Times New Roman" w:eastAsia="標楷體"/>
+          <w:rFonts w:ascii="Times New Roman" w:eastAsia="教育部標準楷書" w:hAnsi="Times New Roman" w:cs="教育部標準楷書"/>
+          <w:sz w:val="24"/>
+          <w:szCs w:val="24"/>
+        </w:rPr>
+      </w:pPr>
+      <w:r>
+        <w:rPr>
+          <w:rFonts w:ascii="Times New Roman" w:hAnsi="Times New Roman" w:eastAsia="教育部標準楷書"/>
           <w:b w:val="0"/>
           <w:sz w:val="24"/>
         </w:rPr>
@@ -1616,14 +1616,14 @@
         <w:ind w:left="420" w:hanging="420"/>
         <w:jc w:val="both"/>
         <w:rPr>
-          <w:rFonts w:ascii="標楷體" w:eastAsia="標楷體" w:hAnsi="標楷體" w:cs="標楷體"/>
-          <w:sz w:val="24"/>
-          <w:szCs w:val="24"/>
-        </w:rPr>
-      </w:pPr>
-      <w:r>
-        <w:rPr>
-          <w:rFonts w:ascii="Times New Roman" w:hAnsi="Times New Roman" w:eastAsia="標楷體"/>
+          <w:rFonts w:ascii="Times New Roman" w:eastAsia="教育部標準楷書" w:hAnsi="Times New Roman" w:cs="教育部標準楷書"/>
+          <w:sz w:val="24"/>
+          <w:szCs w:val="24"/>
+        </w:rPr>
+      </w:pPr>
+      <w:r>
+        <w:rPr>
+          <w:rFonts w:ascii="Times New Roman" w:hAnsi="Times New Roman" w:eastAsia="教育部標準楷書"/>
           <w:b w:val="0"/>
           <w:sz w:val="24"/>
         </w:rPr>
@@ -1636,14 +1636,14 @@
         <w:ind w:left="420" w:hanging="420"/>
         <w:jc w:val="both"/>
         <w:rPr>
-          <w:rFonts w:ascii="標楷體" w:eastAsia="標楷體" w:hAnsi="標楷體" w:cs="標楷體"/>
-          <w:sz w:val="24"/>
-          <w:szCs w:val="24"/>
-        </w:rPr>
-      </w:pPr>
-      <w:r>
-        <w:rPr>
-          <w:rFonts w:ascii="Times New Roman" w:hAnsi="Times New Roman" w:eastAsia="標楷體"/>
+          <w:rFonts w:ascii="Times New Roman" w:eastAsia="教育部標準楷書" w:hAnsi="Times New Roman" w:cs="教育部標準楷書"/>
+          <w:sz w:val="24"/>
+          <w:szCs w:val="24"/>
+        </w:rPr>
+      </w:pPr>
+      <w:r>
+        <w:rPr>
+          <w:rFonts w:ascii="Times New Roman" w:hAnsi="Times New Roman" w:eastAsia="教育部標準楷書"/>
           <w:b w:val="0"/>
           <w:sz w:val="24"/>
         </w:rPr>
@@ -1656,14 +1656,14 @@
         <w:ind w:left="420" w:hanging="420"/>
         <w:jc w:val="both"/>
         <w:rPr>
-          <w:rFonts w:ascii="標楷體" w:eastAsia="標楷體" w:hAnsi="標楷體" w:cs="標楷體"/>
-          <w:sz w:val="24"/>
-          <w:szCs w:val="24"/>
-        </w:rPr>
-      </w:pPr>
-      <w:r>
-        <w:rPr>
-          <w:rFonts w:ascii="Times New Roman" w:hAnsi="Times New Roman" w:eastAsia="標楷體"/>
+          <w:rFonts w:ascii="Times New Roman" w:eastAsia="教育部標準楷書" w:hAnsi="Times New Roman" w:cs="教育部標準楷書"/>
+          <w:sz w:val="24"/>
+          <w:szCs w:val="24"/>
+        </w:rPr>
+      </w:pPr>
+      <w:r>
+        <w:rPr>
+          <w:rFonts w:ascii="Times New Roman" w:hAnsi="Times New Roman" w:eastAsia="教育部標準楷書"/>
           <w:b w:val="0"/>
           <w:sz w:val="24"/>
         </w:rPr>
@@ -1675,18 +1675,18 @@
         <w:spacing w:lineRule="auto" w:line="276" w:after="120"/>
         <w:jc w:val="both"/>
         <w:rPr>
-          <w:rFonts w:ascii="標楷體" w:eastAsia="標楷體" w:hAnsi="標楷體" w:cs="標楷體"/>
-          <w:sz w:val="24"/>
-          <w:szCs w:val="24"/>
-        </w:rPr>
-      </w:pPr>
-    </w:p>
-    <w:p>
-      <w:pPr>
-        <w:spacing w:lineRule="auto" w:line="276" w:after="120"/>
-        <w:jc w:val="both"/>
-        <w:rPr>
-          <w:rFonts w:ascii="標楷體" w:eastAsia="標楷體" w:hAnsi="標楷體" w:cs="標楷體" w:hint="eastAsia"/>
+          <w:rFonts w:ascii="Times New Roman" w:eastAsia="教育部標準楷書" w:hAnsi="Times New Roman" w:cs="教育部標準楷書"/>
+          <w:sz w:val="24"/>
+          <w:szCs w:val="24"/>
+        </w:rPr>
+      </w:pPr>
+    </w:p>
+    <w:p>
+      <w:pPr>
+        <w:spacing w:lineRule="auto" w:line="276" w:after="120"/>
+        <w:jc w:val="both"/>
+        <w:rPr>
+          <w:rFonts w:ascii="Times New Roman" w:eastAsia="教育部標準楷書" w:hAnsi="Times New Roman" w:cs="教育部標準楷書" w:hint="eastAsia"/>
           <w:b/>
           <w:bCs/>
           <w:sz w:val="36"/>
@@ -1706,7 +1706,7 @@
         <w:spacing w:after="200" w:lineRule="auto" w:line="276"/>
         <w:jc w:val="center"/>
         <w:rPr>
-          <w:rFonts w:ascii="標楷體" w:eastAsia="標楷體" w:hAnsi="標楷體" w:cs="標楷體"/>
+          <w:rFonts w:ascii="Times New Roman" w:eastAsia="教育部標準楷書" w:hAnsi="Times New Roman" w:cs="教育部標準楷書"/>
           <w:b/>
           <w:bCs/>
           <w:sz w:val="36"/>
@@ -1715,7 +1715,7 @@
       </w:pPr>
       <w:r>
         <w:rPr>
-          <w:rFonts w:ascii="標楷體" w:eastAsia="標楷體" w:hAnsi="標楷體" w:cs="標楷體"/>
+          <w:rFonts w:ascii="Times New Roman" w:eastAsia="教育部標準楷書" w:hAnsi="Times New Roman" w:cs="教育部標準楷書"/>
           <w:b/>
           <w:bCs/>
           <w:sz w:val="36"/>
@@ -1778,14 +1778,14 @@
               <w:spacing w:lineRule="auto" w:line="276"/>
               <w:jc w:val="both"/>
               <w:rPr>
-                <w:rFonts w:ascii="標楷體" w:eastAsia="標楷體" w:hAnsi="標楷體" w:cs="標楷體"/>
+                <w:rFonts w:ascii="Times New Roman" w:eastAsia="教育部標準楷書" w:hAnsi="Times New Roman" w:cs="教育部標準楷書"/>
                 <w:sz w:val="24"/>
                 <w:szCs w:val="24"/>
               </w:rPr>
             </w:pPr>
             <w:r>
               <w:rPr>
-                <w:rFonts w:ascii="標楷體" w:eastAsia="標楷體" w:hAnsi="標楷體" w:cs="標楷體"/>
+                <w:rFonts w:ascii="Times New Roman" w:eastAsia="教育部標準楷書" w:hAnsi="Times New Roman" w:cs="教育部標準楷書"/>
                 <w:sz w:val="24"/>
                 <w:szCs w:val="24"/>
               </w:rPr>
@@ -1815,14 +1815,14 @@
               <w:spacing w:lineRule="auto" w:line="276" w:after="120"/>
               <w:jc w:val="both"/>
               <w:rPr>
-                <w:rFonts w:ascii="標楷體" w:eastAsia="標楷體" w:hAnsi="標楷體" w:cs="標楷體"/>
+                <w:rFonts w:ascii="Times New Roman" w:eastAsia="教育部標準楷書" w:hAnsi="Times New Roman" w:cs="教育部標準楷書"/>
                 <w:sz w:val="24"/>
                 <w:szCs w:val="24"/>
               </w:rPr>
             </w:pPr>
             <w:r>
               <w:rPr>
-                <w:rFonts w:ascii="Times New Roman" w:hAnsi="Times New Roman" w:eastAsia="標楷體"/>
+                <w:rFonts w:ascii="Times New Roman" w:hAnsi="Times New Roman" w:eastAsia="教育部標準楷書"/>
                 <w:b w:val="0"/>
                 <w:sz w:val="24"/>
               </w:rPr>
@@ -1853,14 +1853,14 @@
               <w:spacing w:lineRule="auto" w:line="276"/>
               <w:jc w:val="both"/>
               <w:rPr>
-                <w:rFonts w:ascii="標楷體" w:eastAsia="標楷體" w:hAnsi="標楷體" w:cs="標楷體"/>
+                <w:rFonts w:ascii="Times New Roman" w:eastAsia="教育部標準楷書" w:hAnsi="Times New Roman" w:cs="教育部標準楷書"/>
                 <w:sz w:val="24"/>
                 <w:szCs w:val="24"/>
               </w:rPr>
             </w:pPr>
             <w:r>
               <w:rPr>
-                <w:rFonts w:ascii="標楷體" w:eastAsia="標楷體" w:hAnsi="標楷體" w:cs="標楷體"/>
+                <w:rFonts w:ascii="Times New Roman" w:eastAsia="教育部標準楷書" w:hAnsi="Times New Roman" w:cs="教育部標準楷書"/>
                 <w:sz w:val="24"/>
                 <w:szCs w:val="24"/>
               </w:rPr>
@@ -1890,7 +1890,7 @@
               <w:spacing w:lineRule="auto" w:line="276" w:after="120"/>
               <w:jc w:val="both"/>
               <w:rPr>
-                <w:rFonts w:ascii="標楷體" w:eastAsia="標楷體" w:hAnsi="標楷體" w:cs="標楷體"/>
+                <w:rFonts w:ascii="Times New Roman" w:eastAsia="教育部標準楷書" w:hAnsi="Times New Roman" w:cs="教育部標準楷書"/>
                 <w:color w:val="FF0000"/>
                 <w:sz w:val="20"/>
                 <w:szCs w:val="20"/>
@@ -1898,7 +1898,7 @@
             </w:pPr>
             <w:r>
               <w:rPr>
-                <w:rFonts w:ascii="Times New Roman" w:hAnsi="Times New Roman" w:eastAsia="標楷體"/>
+                <w:rFonts w:ascii="Times New Roman" w:hAnsi="Times New Roman" w:eastAsia="教育部標準楷書"/>
                 <w:b w:val="0"/>
                 <w:sz w:val="24"/>
               </w:rPr>
@@ -1929,14 +1929,14 @@
               <w:spacing w:lineRule="auto" w:line="276"/>
               <w:jc w:val="both"/>
               <w:rPr>
-                <w:rFonts w:ascii="標楷體" w:eastAsia="標楷體" w:hAnsi="標楷體" w:cs="標楷體"/>
+                <w:rFonts w:ascii="Times New Roman" w:eastAsia="教育部標準楷書" w:hAnsi="Times New Roman" w:cs="教育部標準楷書"/>
                 <w:sz w:val="24"/>
                 <w:szCs w:val="24"/>
               </w:rPr>
             </w:pPr>
             <w:r>
               <w:rPr>
-                <w:rFonts w:ascii="標楷體" w:eastAsia="標楷體" w:hAnsi="標楷體" w:cs="標楷體"/>
+                <w:rFonts w:ascii="Times New Roman" w:eastAsia="教育部標準楷書" w:hAnsi="Times New Roman" w:cs="教育部標準楷書"/>
                 <w:sz w:val="24"/>
                 <w:szCs w:val="24"/>
               </w:rPr>
@@ -1966,14 +1966,14 @@
               <w:spacing w:lineRule="auto" w:line="276" w:after="120"/>
               <w:jc w:val="both"/>
               <w:rPr>
-                <w:rFonts w:ascii="標楷體" w:eastAsia="標楷體" w:hAnsi="標楷體" w:cs="標楷體"/>
+                <w:rFonts w:ascii="Times New Roman" w:eastAsia="教育部標準楷書" w:hAnsi="Times New Roman" w:cs="教育部標準楷書"/>
                 <w:sz w:val="24"/>
                 <w:szCs w:val="24"/>
               </w:rPr>
             </w:pPr>
             <w:r>
               <w:rPr>
-                <w:rFonts w:ascii="Times New Roman" w:hAnsi="Times New Roman" w:eastAsia="標楷體"/>
+                <w:rFonts w:ascii="Times New Roman" w:hAnsi="Times New Roman" w:eastAsia="教育部標準楷書"/>
                 <w:b w:val="0"/>
                 <w:sz w:val="24"/>
               </w:rPr>
@@ -2010,14 +2010,14 @@
               <w:spacing w:lineRule="auto" w:line="276"/>
               <w:jc w:val="both"/>
               <w:rPr>
-                <w:rFonts w:ascii="標楷體" w:eastAsia="標楷體" w:hAnsi="標楷體" w:cs="標楷體"/>
+                <w:rFonts w:ascii="Times New Roman" w:eastAsia="教育部標準楷書" w:hAnsi="Times New Roman" w:cs="教育部標準楷書"/>
                 <w:sz w:val="24"/>
                 <w:szCs w:val="24"/>
               </w:rPr>
             </w:pPr>
             <w:r>
               <w:rPr>
-                <w:rFonts w:ascii="標楷體" w:eastAsia="標楷體" w:hAnsi="標楷體" w:cs="標楷體"/>
+                <w:rFonts w:ascii="Times New Roman" w:eastAsia="教育部標準楷書" w:hAnsi="Times New Roman" w:cs="教育部標準楷書"/>
                 <w:sz w:val="24"/>
                 <w:szCs w:val="24"/>
               </w:rPr>
@@ -2030,14 +2030,14 @@
               <w:ind w:left="-90" w:right="-233"/>
               <w:jc w:val="both"/>
               <w:rPr>
-                <w:rFonts w:ascii="標楷體" w:eastAsia="標楷體" w:hAnsi="標楷體" w:cs="標楷體"/>
+                <w:rFonts w:ascii="Times New Roman" w:eastAsia="教育部標準楷書" w:hAnsi="Times New Roman" w:cs="教育部標準楷書"/>
                 <w:sz w:val="24"/>
                 <w:szCs w:val="24"/>
               </w:rPr>
             </w:pPr>
             <w:r>
               <w:rPr>
-                <w:rFonts w:ascii="標楷體" w:eastAsia="標楷體" w:hAnsi="標楷體" w:cs="標楷體"/>
+                <w:rFonts w:ascii="Times New Roman" w:eastAsia="教育部標準楷書" w:hAnsi="Times New Roman" w:cs="教育部標準楷書"/>
                 <w:sz w:val="20"/>
                 <w:szCs w:val="20"/>
               </w:rPr>
@@ -2075,7 +2075,7 @@
               <w:spacing w:lineRule="auto" w:line="276"/>
               <w:jc w:val="both"/>
               <w:rPr>
-                <w:rFonts w:ascii="標楷體" w:eastAsia="標楷體" w:hAnsi="標楷體" w:cs="標楷體"/>
+                <w:rFonts w:ascii="Times New Roman" w:eastAsia="教育部標準楷書" w:hAnsi="Times New Roman" w:cs="教育部標準楷書"/>
                 <w:color w:val="FF0000"/>
                 <w:sz w:val="20"/>
                 <w:szCs w:val="20"/>
@@ -2083,7 +2083,7 @@
             </w:pPr>
             <w:r>
               <w:rPr>
-                <w:rFonts w:ascii="標楷體" w:eastAsia="標楷體" w:hAnsi="標楷體" w:cs="標楷體"/>
+                <w:rFonts w:ascii="Times New Roman" w:eastAsia="教育部標準楷書" w:hAnsi="Times New Roman" w:cs="教育部標準楷書"/>
                 <w:sz w:val="24"/>
                 <w:szCs w:val="24"/>
               </w:rPr>
@@ -2099,7 +2099,7 @@
               <w:spacing w:lineRule="auto" w:line="276"/>
               <w:jc w:val="both"/>
               <w:rPr>
-                <w:rFonts w:ascii="標楷體" w:eastAsia="標楷體" w:hAnsi="標楷體" w:cs="標楷體"/>
+                <w:rFonts w:ascii="Times New Roman" w:eastAsia="教育部標準楷書" w:hAnsi="Times New Roman" w:cs="教育部標準楷書"/>
                 <w:color w:val="FF0000"/>
                 <w:sz w:val="20"/>
                 <w:szCs w:val="20"/>
@@ -2107,7 +2107,7 @@
             </w:pPr>
             <w:r>
               <w:rPr>
-                <w:rFonts w:ascii="標楷體" w:eastAsia="標楷體" w:hAnsi="標楷體" w:cs="標楷體"/>
+                <w:rFonts w:ascii="Times New Roman" w:eastAsia="教育部標準楷書" w:hAnsi="Times New Roman" w:cs="教育部標準楷書"/>
                 <w:color w:val="FF0000"/>
                 <w:sz w:val="20"/>
                 <w:szCs w:val="20"/>
@@ -2124,7 +2124,7 @@
               <w:spacing w:lineRule="auto" w:line="276"/>
               <w:jc w:val="both"/>
               <w:rPr>
-                <w:rFonts w:ascii="標楷體" w:eastAsia="標楷體" w:hAnsi="標楷體" w:cs="標楷體"/>
+                <w:rFonts w:ascii="Times New Roman" w:eastAsia="教育部標準楷書" w:hAnsi="Times New Roman" w:cs="教育部標準楷書"/>
                 <w:color w:val="FF0000"/>
                 <w:sz w:val="20"/>
                 <w:szCs w:val="20"/>
@@ -2132,7 +2132,7 @@
             </w:pPr>
             <w:r>
               <w:rPr>
-                <w:rFonts w:ascii="標楷體" w:eastAsia="標楷體" w:hAnsi="標楷體" w:cs="標楷體"/>
+                <w:rFonts w:ascii="Times New Roman" w:eastAsia="教育部標準楷書" w:hAnsi="Times New Roman" w:cs="教育部標準楷書"/>
                 <w:color w:val="FF0000"/>
                 <w:sz w:val="20"/>
                 <w:szCs w:val="20"/>
@@ -2164,7 +2164,7 @@
               <w:spacing w:lineRule="auto" w:line="276"/>
               <w:jc w:val="both"/>
               <w:rPr>
-                <w:rFonts w:ascii="標楷體" w:eastAsia="標楷體" w:hAnsi="標楷體" w:cs="標楷體"/>
+                <w:rFonts w:ascii="Times New Roman" w:eastAsia="教育部標準楷書" w:hAnsi="Times New Roman" w:cs="教育部標準楷書"/>
                 <w:color w:val="FF0000"/>
                 <w:sz w:val="20"/>
                 <w:szCs w:val="20"/>
@@ -2172,7 +2172,7 @@
             </w:pPr>
             <w:r>
               <w:rPr>
-                <w:rFonts w:ascii="標楷體" w:eastAsia="標楷體" w:hAnsi="標楷體" w:cs="標楷體"/>
+                <w:rFonts w:ascii="Times New Roman" w:eastAsia="教育部標準楷書" w:hAnsi="Times New Roman" w:cs="教育部標準楷書"/>
                 <w:sz w:val="24"/>
                 <w:szCs w:val="24"/>
               </w:rPr>
@@ -2195,7 +2195,7 @@
               <w:spacing w:lineRule="auto" w:line="276"/>
               <w:jc w:val="both"/>
               <w:rPr>
-                <w:rFonts w:ascii="標楷體" w:eastAsia="標楷體" w:hAnsi="標楷體" w:cs="標楷體"/>
+                <w:rFonts w:ascii="Times New Roman" w:eastAsia="教育部標準楷書" w:hAnsi="Times New Roman" w:cs="教育部標準楷書"/>
                 <w:color w:val="FF0000"/>
                 <w:sz w:val="20"/>
                 <w:szCs w:val="20"/>
@@ -2203,7 +2203,7 @@
             </w:pPr>
             <w:r>
               <w:rPr>
-                <w:rFonts w:ascii="標楷體" w:eastAsia="標楷體" w:hAnsi="標楷體" w:cs="標楷體"/>
+                <w:rFonts w:ascii="Times New Roman" w:eastAsia="教育部標準楷書" w:hAnsi="Times New Roman" w:cs="教育部標準楷書"/>
                 <w:color w:val="FF0000"/>
                 <w:sz w:val="20"/>
                 <w:szCs w:val="20"/>
@@ -2227,7 +2227,7 @@
               <w:spacing w:lineRule="auto" w:line="276"/>
               <w:jc w:val="both"/>
               <w:rPr>
-                <w:rFonts w:ascii="標楷體" w:eastAsia="標楷體" w:hAnsi="標楷體" w:cs="標楷體"/>
+                <w:rFonts w:ascii="Times New Roman" w:eastAsia="教育部標準楷書" w:hAnsi="Times New Roman" w:cs="教育部標準楷書"/>
                 <w:color w:val="FF0000"/>
                 <w:sz w:val="20"/>
                 <w:szCs w:val="20"/>
@@ -2235,7 +2235,7 @@
             </w:pPr>
             <w:r>
               <w:rPr>
-                <w:rFonts w:ascii="標楷體" w:eastAsia="標楷體" w:hAnsi="標楷體" w:cs="標楷體"/>
+                <w:rFonts w:ascii="Times New Roman" w:eastAsia="教育部標準楷書" w:hAnsi="Times New Roman" w:cs="教育部標準楷書"/>
                 <w:color w:val="FF0000"/>
                 <w:sz w:val="20"/>
                 <w:szCs w:val="20"/>
@@ -2267,7 +2267,7 @@
               <w:spacing w:lineRule="auto" w:line="276"/>
               <w:jc w:val="both"/>
               <w:rPr>
-                <w:rFonts w:ascii="標楷體" w:eastAsia="標楷體" w:hAnsi="標楷體" w:cs="標楷體"/>
+                <w:rFonts w:ascii="Times New Roman" w:eastAsia="教育部標準楷書" w:hAnsi="Times New Roman" w:cs="教育部標準楷書"/>
                 <w:color w:val="FF0000"/>
                 <w:sz w:val="20"/>
                 <w:szCs w:val="20"/>
@@ -2279,7 +2279,7 @@
               <w:spacing w:lineRule="auto" w:line="276"/>
               <w:jc w:val="both"/>
               <w:rPr>
-                <w:rFonts w:ascii="標楷體" w:eastAsia="標楷體" w:hAnsi="標楷體" w:cs="標楷體"/>
+                <w:rFonts w:ascii="Times New Roman" w:eastAsia="教育部標準楷書" w:hAnsi="Times New Roman" w:cs="教育部標準楷書"/>
                 <w:color w:val="FF0000"/>
                 <w:sz w:val="20"/>
                 <w:szCs w:val="20"/>
@@ -2287,7 +2287,7 @@
             </w:pPr>
             <w:r>
               <w:rPr>
-                <w:rFonts w:ascii="標楷體" w:eastAsia="標楷體" w:hAnsi="標楷體" w:cs="標楷體"/>
+                <w:rFonts w:ascii="Times New Roman" w:eastAsia="教育部標準楷書" w:hAnsi="Times New Roman" w:cs="教育部標準楷書"/>
                 <w:sz w:val="24"/>
                 <w:szCs w:val="24"/>
               </w:rPr>
@@ -2310,7 +2310,7 @@
               <w:spacing w:lineRule="auto" w:line="276"/>
               <w:jc w:val="both"/>
               <w:rPr>
-                <w:rFonts w:ascii="標楷體" w:eastAsia="標楷體" w:hAnsi="標楷體" w:cs="標楷體"/>
+                <w:rFonts w:ascii="Times New Roman" w:eastAsia="教育部標準楷書" w:hAnsi="Times New Roman" w:cs="教育部標準楷書"/>
                 <w:color w:val="FF0000"/>
                 <w:sz w:val="20"/>
                 <w:szCs w:val="20"/>
@@ -2318,7 +2318,7 @@
             </w:pPr>
             <w:r>
               <w:rPr>
-                <w:rFonts w:ascii="標楷體" w:eastAsia="標楷體" w:hAnsi="標楷體" w:cs="標楷體"/>
+                <w:rFonts w:ascii="Times New Roman" w:eastAsia="教育部標準楷書" w:hAnsi="Times New Roman" w:cs="教育部標準楷書"/>
                 <w:color w:val="FF0000"/>
                 <w:sz w:val="20"/>
                 <w:szCs w:val="20"/>
@@ -2342,7 +2342,7 @@
               <w:spacing w:lineRule="auto" w:line="276"/>
               <w:jc w:val="both"/>
               <w:rPr>
-                <w:rFonts w:ascii="標楷體" w:eastAsia="標楷體" w:hAnsi="標楷體" w:cs="標楷體"/>
+                <w:rFonts w:ascii="Times New Roman" w:eastAsia="教育部標準楷書" w:hAnsi="Times New Roman" w:cs="教育部標準楷書"/>
                 <w:color w:val="FF0000"/>
                 <w:sz w:val="20"/>
                 <w:szCs w:val="20"/>
@@ -2350,7 +2350,7 @@
             </w:pPr>
             <w:r>
               <w:rPr>
-                <w:rFonts w:ascii="標楷體" w:eastAsia="標楷體" w:hAnsi="標楷體" w:cs="標楷體"/>
+                <w:rFonts w:ascii="Times New Roman" w:eastAsia="教育部標準楷書" w:hAnsi="Times New Roman" w:cs="教育部標準楷書"/>
                 <w:color w:val="FF0000"/>
                 <w:sz w:val="20"/>
                 <w:szCs w:val="20"/>
@@ -2382,14 +2382,14 @@
               <w:spacing w:lineRule="auto" w:line="276"/>
               <w:jc w:val="both"/>
               <w:rPr>
-                <w:rFonts w:ascii="標楷體" w:eastAsia="標楷體" w:hAnsi="標楷體" w:cs="標楷體"/>
+                <w:rFonts w:ascii="Times New Roman" w:eastAsia="教育部標準楷書" w:hAnsi="Times New Roman" w:cs="教育部標準楷書"/>
                 <w:sz w:val="24"/>
                 <w:szCs w:val="24"/>
               </w:rPr>
             </w:pPr>
             <w:r>
               <w:rPr>
-                <w:rFonts w:ascii="標楷體" w:eastAsia="標楷體" w:hAnsi="標楷體" w:cs="標楷體"/>
+                <w:rFonts w:ascii="Times New Roman" w:eastAsia="教育部標準楷書" w:hAnsi="Times New Roman" w:cs="教育部標準楷書"/>
                 <w:sz w:val="24"/>
                 <w:szCs w:val="24"/>
               </w:rPr>
@@ -2408,14 +2408,14 @@
               <w:spacing w:lineRule="auto" w:line="276"/>
               <w:jc w:val="both"/>
               <w:rPr>
-                <w:rFonts w:ascii="標楷體" w:eastAsia="標楷體" w:hAnsi="標楷體" w:cs="標楷體"/>
+                <w:rFonts w:ascii="Times New Roman" w:eastAsia="教育部標準楷書" w:hAnsi="Times New Roman" w:cs="教育部標準楷書"/>
                 <w:sz w:val="24"/>
                 <w:szCs w:val="24"/>
               </w:rPr>
             </w:pPr>
             <w:r>
               <w:rPr>
-                <w:rFonts w:ascii="標楷體" w:eastAsia="標楷體" w:hAnsi="標楷體" w:cs="標楷體"/>
+                <w:rFonts w:ascii="Times New Roman" w:eastAsia="教育部標準楷書" w:hAnsi="Times New Roman" w:cs="教育部標準楷書"/>
                 <w:color w:val="FF0000"/>
                 <w:sz w:val="20"/>
                 <w:szCs w:val="20"/>
@@ -2447,14 +2447,14 @@
               <w:spacing w:lineRule="auto" w:line="276"/>
               <w:jc w:val="both"/>
               <w:rPr>
-                <w:rFonts w:ascii="標楷體" w:eastAsia="標楷體" w:hAnsi="標楷體" w:cs="標楷體"/>
+                <w:rFonts w:ascii="Times New Roman" w:eastAsia="教育部標準楷書" w:hAnsi="Times New Roman" w:cs="教育部標準楷書"/>
                 <w:sz w:val="24"/>
                 <w:szCs w:val="24"/>
               </w:rPr>
             </w:pPr>
             <w:r>
               <w:rPr>
-                <w:rFonts w:ascii="標楷體" w:eastAsia="標楷體" w:hAnsi="標楷體" w:cs="標楷體"/>
+                <w:rFonts w:ascii="Times New Roman" w:eastAsia="教育部標準楷書" w:hAnsi="Times New Roman" w:cs="教育部標準楷書"/>
                 <w:sz w:val="24"/>
                 <w:szCs w:val="24"/>
               </w:rPr>
@@ -2492,7 +2492,7 @@
               <w:ind w:left="140" w:hanging="120"/>
               <w:jc w:val="both"/>
               <w:rPr>
-                <w:rFonts w:ascii="標楷體" w:eastAsia="標楷體" w:hAnsi="標楷體" w:cs="標楷體"/>
+                <w:rFonts w:ascii="Times New Roman" w:eastAsia="教育部標準楷書" w:hAnsi="Times New Roman" w:cs="教育部標準楷書"/>
                 <w:color w:val="FF0000"/>
                 <w:sz w:val="24"/>
                 <w:szCs w:val="24"/>
@@ -2500,7 +2500,7 @@
             </w:pPr>
             <w:r>
               <w:rPr>
-                <w:rFonts w:ascii="標楷體" w:eastAsia="標楷體" w:hAnsi="標楷體" w:cs="標楷體"/>
+                <w:rFonts w:ascii="Times New Roman" w:eastAsia="教育部標準楷書" w:hAnsi="Times New Roman" w:cs="教育部標準楷書"/>
                 <w:color w:val="FF0000"/>
                 <w:sz w:val="24"/>
                 <w:szCs w:val="24"/>
@@ -2532,7 +2532,7 @@
               <w:ind w:left="140" w:hanging="120"/>
               <w:jc w:val="both"/>
               <w:rPr>
-                <w:rFonts w:ascii="標楷體" w:eastAsia="標楷體" w:hAnsi="標楷體" w:cs="標楷體"/>
+                <w:rFonts w:ascii="Times New Roman" w:eastAsia="教育部標準楷書" w:hAnsi="Times New Roman" w:cs="教育部標準楷書"/>
                 <w:color w:val="FF0000"/>
                 <w:sz w:val="24"/>
                 <w:szCs w:val="24"/>
@@ -2540,7 +2540,7 @@
             </w:pPr>
             <w:r>
               <w:rPr>
-                <w:rFonts w:ascii="標楷體" w:eastAsia="標楷體" w:hAnsi="標楷體" w:cs="標楷體"/>
+                <w:rFonts w:ascii="Times New Roman" w:eastAsia="教育部標準楷書" w:hAnsi="Times New Roman" w:cs="教育部標準楷書"/>
                 <w:color w:val="FF0000"/>
                 <w:sz w:val="24"/>
                 <w:szCs w:val="24"/>
@@ -2554,14 +2554,14 @@
               <w:ind w:left="140" w:hanging="120"/>
               <w:jc w:val="both"/>
               <w:rPr>
-                <w:rFonts w:ascii="標楷體" w:eastAsia="標楷體" w:hAnsi="標楷體" w:cs="標楷體"/>
+                <w:rFonts w:ascii="Times New Roman" w:eastAsia="教育部標準楷書" w:hAnsi="Times New Roman" w:cs="教育部標準楷書"/>
                 <w:sz w:val="24"/>
                 <w:szCs w:val="24"/>
               </w:rPr>
             </w:pPr>
             <w:r>
               <w:rPr>
-                <w:rFonts w:ascii="標楷體" w:eastAsia="標楷體" w:hAnsi="標楷體" w:cs="標楷體"/>
+                <w:rFonts w:ascii="Times New Roman" w:eastAsia="教育部標準楷書" w:hAnsi="Times New Roman" w:cs="教育部標準楷書"/>
                 <w:sz w:val="24"/>
                 <w:szCs w:val="24"/>
               </w:rPr>
@@ -2574,14 +2574,14 @@
               <w:ind w:left="140" w:hanging="120"/>
               <w:jc w:val="both"/>
               <w:rPr>
-                <w:rFonts w:ascii="標楷體" w:eastAsia="標楷體" w:hAnsi="標楷體" w:cs="標楷體"/>
+                <w:rFonts w:ascii="Times New Roman" w:eastAsia="教育部標準楷書" w:hAnsi="Times New Roman" w:cs="教育部標準楷書"/>
                 <w:sz w:val="24"/>
                 <w:szCs w:val="24"/>
               </w:rPr>
             </w:pPr>
             <w:r>
               <w:rPr>
-                <w:rFonts w:ascii="標楷體" w:eastAsia="標楷體" w:hAnsi="標楷體" w:cs="標楷體"/>
+                <w:rFonts w:ascii="Times New Roman" w:eastAsia="教育部標準楷書" w:hAnsi="Times New Roman" w:cs="教育部標準楷書"/>
                 <w:sz w:val="24"/>
                 <w:szCs w:val="24"/>
               </w:rPr>
@@ -2611,14 +2611,14 @@
               <w:spacing w:lineRule="auto" w:line="276"/>
               <w:jc w:val="both"/>
               <w:rPr>
-                <w:rFonts w:ascii="標楷體" w:eastAsia="標楷體" w:hAnsi="標楷體" w:cs="標楷體"/>
+                <w:rFonts w:ascii="Times New Roman" w:eastAsia="教育部標準楷書" w:hAnsi="Times New Roman" w:cs="教育部標準楷書"/>
                 <w:sz w:val="24"/>
                 <w:szCs w:val="24"/>
               </w:rPr>
             </w:pPr>
             <w:r>
               <w:rPr>
-                <w:rFonts w:ascii="標楷體" w:eastAsia="標楷體" w:hAnsi="標楷體" w:cs="標楷體"/>
+                <w:rFonts w:ascii="Times New Roman" w:eastAsia="教育部標準楷書" w:hAnsi="Times New Roman" w:cs="教育部標準楷書"/>
                 <w:sz w:val="24"/>
                 <w:szCs w:val="24"/>
               </w:rPr>
@@ -2630,7 +2630,7 @@
               <w:spacing w:lineRule="auto" w:line="276"/>
               <w:jc w:val="both"/>
               <w:rPr>
-                <w:rFonts w:ascii="標楷體" w:eastAsia="標楷體" w:hAnsi="標楷體" w:cs="標楷體"/>
+                <w:rFonts w:ascii="Times New Roman" w:eastAsia="教育部標準楷書" w:hAnsi="Times New Roman" w:cs="教育部標準楷書"/>
                 <w:sz w:val="24"/>
                 <w:szCs w:val="24"/>
               </w:rPr>
@@ -2659,7 +2659,7 @@
               <w:spacing w:lineRule="auto" w:line="276"/>
               <w:jc w:val="both"/>
               <w:rPr>
-                <w:rFonts w:ascii="標楷體" w:eastAsia="標楷體" w:hAnsi="標楷體" w:cs="標楷體"/>
+                <w:rFonts w:ascii="Times New Roman" w:eastAsia="教育部標準楷書" w:hAnsi="Times New Roman" w:cs="教育部標準楷書"/>
                 <w:sz w:val="24"/>
                 <w:szCs w:val="24"/>
                 <w:lang w:val="en-US"/>
@@ -2667,7 +2667,7 @@
             </w:pPr>
             <w:r>
               <w:rPr>
-                <w:rFonts w:ascii="標楷體" w:eastAsia="標楷體" w:hAnsi="標楷體" w:cs="標楷體"/>
+                <w:rFonts w:ascii="Times New Roman" w:eastAsia="教育部標準楷書" w:hAnsi="Times New Roman" w:cs="教育部標準楷書"/>
                 <w:sz w:val="24"/>
                 <w:szCs w:val="24"/>
                 <w:lang w:val="en-US"/>
@@ -2698,14 +2698,14 @@
               <w:spacing w:lineRule="auto" w:line="276"/>
               <w:jc w:val="both"/>
               <w:rPr>
-                <w:rFonts w:ascii="標楷體" w:eastAsia="標楷體" w:hAnsi="標楷體" w:cs="標楷體"/>
+                <w:rFonts w:ascii="Times New Roman" w:eastAsia="教育部標準楷書" w:hAnsi="Times New Roman" w:cs="教育部標準楷書"/>
                 <w:sz w:val="24"/>
                 <w:szCs w:val="24"/>
               </w:rPr>
             </w:pPr>
             <w:r>
               <w:rPr>
-                <w:rFonts w:ascii="標楷體" w:eastAsia="標楷體" w:hAnsi="標楷體" w:cs="標楷體"/>
+                <w:rFonts w:ascii="Times New Roman" w:eastAsia="教育部標準楷書" w:hAnsi="Times New Roman" w:cs="教育部標準楷書"/>
                 <w:sz w:val="24"/>
                 <w:szCs w:val="24"/>
               </w:rPr>
@@ -2735,7 +2735,7 @@
               <w:spacing w:lineRule="auto" w:line="276"/>
               <w:jc w:val="both"/>
               <w:rPr>
-                <w:rFonts w:ascii="標楷體" w:eastAsia="標楷體" w:hAnsi="標楷體" w:cs="標楷體"/>
+                <w:rFonts w:ascii="Times New Roman" w:eastAsia="教育部標準楷書" w:hAnsi="Times New Roman" w:cs="教育部標準楷書"/>
                 <w:sz w:val="24"/>
                 <w:szCs w:val="24"/>
                 <w:lang w:val="en-US"/>
@@ -2743,7 +2743,7 @@
             </w:pPr>
             <w:r>
               <w:rPr>
-                <w:rFonts w:ascii="標楷體" w:eastAsia="標楷體" w:hAnsi="標楷體" w:cs="標楷體"/>
+                <w:rFonts w:ascii="Times New Roman" w:eastAsia="教育部標準楷書" w:hAnsi="Times New Roman" w:cs="教育部標準楷書"/>
                 <w:sz w:val="24"/>
                 <w:szCs w:val="24"/>
                 <w:lang w:val="en-US"/>
@@ -2753,7 +2753,7 @@
             <w:proofErr w:type="gramStart"/>
             <w:r>
               <w:rPr>
-                <w:rFonts w:ascii="標楷體" w:eastAsia="標楷體" w:hAnsi="標楷體" w:cs="標楷體"/>
+                <w:rFonts w:ascii="Times New Roman" w:eastAsia="教育部標準楷書" w:hAnsi="Times New Roman" w:cs="教育部標準楷書"/>
                 <w:sz w:val="24"/>
                 <w:szCs w:val="24"/>
                 <w:lang w:val="en-US"/>
@@ -2763,7 +2763,7 @@
             <w:proofErr w:type="gramEnd"/>
             <w:r>
               <w:rPr>
-                <w:rFonts w:ascii="標楷體" w:eastAsia="標楷體" w:hAnsi="標楷體" w:cs="標楷體"/>
+                <w:rFonts w:ascii="Times New Roman" w:eastAsia="教育部標準楷書" w:hAnsi="Times New Roman" w:cs="教育部標準楷書"/>
                 <w:sz w:val="24"/>
                 <w:szCs w:val="24"/>
                 <w:lang w:val="en-US"/>
@@ -2801,14 +2801,14 @@
               <w:spacing w:lineRule="auto" w:line="276"/>
               <w:jc w:val="both"/>
               <w:rPr>
-                <w:rFonts w:ascii="標楷體" w:eastAsia="標楷體" w:hAnsi="標楷體" w:cs="標楷體"/>
+                <w:rFonts w:ascii="Times New Roman" w:eastAsia="教育部標準楷書" w:hAnsi="Times New Roman" w:cs="教育部標準楷書"/>
                 <w:sz w:val="24"/>
                 <w:szCs w:val="24"/>
               </w:rPr>
             </w:pPr>
             <w:r>
               <w:rPr>
-                <w:rFonts w:ascii="標楷體" w:eastAsia="標楷體" w:hAnsi="標楷體" w:cs="標楷體"/>
+                <w:rFonts w:ascii="Times New Roman" w:eastAsia="教育部標準楷書" w:hAnsi="Times New Roman" w:cs="教育部標準楷書"/>
                 <w:sz w:val="24"/>
                 <w:szCs w:val="24"/>
               </w:rPr>
@@ -2838,14 +2838,14 @@
               <w:spacing w:lineRule="auto" w:line="276"/>
               <w:jc w:val="both"/>
               <w:rPr>
-                <w:rFonts w:ascii="標楷體" w:eastAsia="標楷體" w:hAnsi="標楷體" w:cs="標楷體"/>
+                <w:rFonts w:ascii="Times New Roman" w:eastAsia="教育部標準楷書" w:hAnsi="Times New Roman" w:cs="教育部標準楷書"/>
                 <w:sz w:val="24"/>
                 <w:szCs w:val="24"/>
               </w:rPr>
             </w:pPr>
             <w:r>
               <w:rPr>
-                <w:rFonts w:ascii="標楷體" w:eastAsia="標楷體" w:hAnsi="標楷體" w:cs="標楷體"/>
+                <w:rFonts w:ascii="Times New Roman" w:eastAsia="教育部標準楷書" w:hAnsi="Times New Roman" w:cs="教育部標準楷書"/>
                 <w:sz w:val="24"/>
                 <w:szCs w:val="24"/>
               </w:rPr>
@@ -2875,14 +2875,14 @@
               <w:spacing w:lineRule="auto" w:line="276"/>
               <w:jc w:val="both"/>
               <w:rPr>
-                <w:rFonts w:ascii="標楷體" w:eastAsia="標楷體" w:hAnsi="標楷體" w:cs="標楷體"/>
+                <w:rFonts w:ascii="Times New Roman" w:eastAsia="教育部標準楷書" w:hAnsi="Times New Roman" w:cs="教育部標準楷書"/>
                 <w:sz w:val="24"/>
                 <w:szCs w:val="24"/>
               </w:rPr>
             </w:pPr>
             <w:r>
               <w:rPr>
-                <w:rFonts w:ascii="標楷體" w:eastAsia="標楷體" w:hAnsi="標楷體" w:cs="標楷體"/>
+                <w:rFonts w:ascii="Times New Roman" w:eastAsia="教育部標準楷書" w:hAnsi="Times New Roman" w:cs="教育部標準楷書"/>
                 <w:sz w:val="24"/>
                 <w:szCs w:val="24"/>
               </w:rPr>
@@ -2912,14 +2912,14 @@
               <w:spacing w:lineRule="auto" w:line="276"/>
               <w:jc w:val="both"/>
               <w:rPr>
-                <w:rFonts w:ascii="標楷體" w:eastAsia="標楷體" w:hAnsi="標楷體" w:cs="標楷體"/>
+                <w:rFonts w:ascii="Times New Roman" w:eastAsia="教育部標準楷書" w:hAnsi="Times New Roman" w:cs="教育部標準楷書"/>
                 <w:sz w:val="24"/>
                 <w:szCs w:val="24"/>
               </w:rPr>
             </w:pPr>
             <w:r>
               <w:rPr>
-                <w:rFonts w:ascii="標楷體" w:eastAsia="標楷體" w:hAnsi="標楷體" w:cs="標楷體"/>
+                <w:rFonts w:ascii="Times New Roman" w:eastAsia="教育部標準楷書" w:hAnsi="Times New Roman" w:cs="教育部標準楷書"/>
                 <w:sz w:val="24"/>
                 <w:szCs w:val="24"/>
               </w:rPr>
@@ -2949,14 +2949,14 @@
               <w:spacing w:lineRule="auto" w:line="276"/>
               <w:jc w:val="both"/>
               <w:rPr>
-                <w:rFonts w:ascii="標楷體" w:eastAsia="標楷體" w:hAnsi="標楷體" w:cs="標楷體"/>
+                <w:rFonts w:ascii="Times New Roman" w:eastAsia="教育部標準楷書" w:hAnsi="Times New Roman" w:cs="教育部標準楷書"/>
                 <w:sz w:val="24"/>
                 <w:szCs w:val="24"/>
               </w:rPr>
             </w:pPr>
             <w:r>
               <w:rPr>
-                <w:rFonts w:ascii="標楷體" w:eastAsia="標楷體" w:hAnsi="標楷體" w:cs="標楷體"/>
+                <w:rFonts w:ascii="Times New Roman" w:eastAsia="教育部標準楷書" w:hAnsi="Times New Roman" w:cs="教育部標準楷書"/>
                 <w:sz w:val="24"/>
                 <w:szCs w:val="24"/>
               </w:rPr>
@@ -2986,14 +2986,14 @@
               <w:spacing w:lineRule="auto" w:line="276"/>
               <w:jc w:val="both"/>
               <w:rPr>
-                <w:rFonts w:ascii="標楷體" w:eastAsia="標楷體" w:hAnsi="標楷體" w:cs="標楷體"/>
+                <w:rFonts w:ascii="Times New Roman" w:eastAsia="教育部標準楷書" w:hAnsi="Times New Roman" w:cs="教育部標準楷書"/>
                 <w:sz w:val="24"/>
                 <w:szCs w:val="24"/>
               </w:rPr>
             </w:pPr>
             <w:r>
               <w:rPr>
-                <w:rFonts w:ascii="標楷體" w:eastAsia="標楷體" w:hAnsi="標楷體" w:cs="標楷體"/>
+                <w:rFonts w:ascii="Times New Roman" w:eastAsia="教育部標準楷書" w:hAnsi="Times New Roman" w:cs="教育部標準楷書"/>
                 <w:sz w:val="24"/>
                 <w:szCs w:val="24"/>
               </w:rPr>
@@ -3030,14 +3030,14 @@
               <w:spacing w:lineRule="auto" w:line="276"/>
               <w:jc w:val="both"/>
               <w:rPr>
-                <w:rFonts w:ascii="標楷體" w:eastAsia="標楷體" w:hAnsi="標楷體" w:cs="標楷體"/>
+                <w:rFonts w:ascii="Times New Roman" w:eastAsia="教育部標準楷書" w:hAnsi="Times New Roman" w:cs="教育部標準楷書"/>
                 <w:sz w:val="24"/>
                 <w:szCs w:val="24"/>
               </w:rPr>
             </w:pPr>
             <w:r>
               <w:rPr>
-                <w:rFonts w:ascii="標楷體" w:eastAsia="標楷體" w:hAnsi="標楷體" w:cs="標楷體"/>
+                <w:rFonts w:ascii="Times New Roman" w:eastAsia="教育部標準楷書" w:hAnsi="Times New Roman" w:cs="教育部標準楷書"/>
                 <w:sz w:val="24"/>
                 <w:szCs w:val="24"/>
               </w:rPr>
@@ -3067,14 +3067,14 @@
               <w:spacing w:lineRule="auto" w:line="276"/>
               <w:jc w:val="both"/>
               <w:rPr>
-                <w:rFonts w:ascii="標楷體" w:eastAsia="標楷體" w:hAnsi="標楷體" w:cs="標楷體"/>
+                <w:rFonts w:ascii="Times New Roman" w:eastAsia="教育部標準楷書" w:hAnsi="Times New Roman" w:cs="教育部標準楷書"/>
                 <w:sz w:val="24"/>
                 <w:szCs w:val="24"/>
               </w:rPr>
             </w:pPr>
             <w:r>
               <w:rPr>
-                <w:rFonts w:ascii="標楷體" w:eastAsia="標楷體" w:hAnsi="標楷體" w:cs="標楷體"/>
+                <w:rFonts w:ascii="Times New Roman" w:eastAsia="教育部標準楷書" w:hAnsi="Times New Roman" w:cs="教育部標準楷書"/>
                 <w:sz w:val="24"/>
                 <w:szCs w:val="24"/>
               </w:rPr>
@@ -3104,14 +3104,14 @@
               <w:spacing w:lineRule="auto" w:line="276"/>
               <w:jc w:val="both"/>
               <w:rPr>
-                <w:rFonts w:ascii="標楷體" w:eastAsia="標楷體" w:hAnsi="標楷體" w:cs="標楷體"/>
+                <w:rFonts w:ascii="Times New Roman" w:eastAsia="教育部標準楷書" w:hAnsi="Times New Roman" w:cs="教育部標準楷書"/>
                 <w:sz w:val="24"/>
                 <w:szCs w:val="24"/>
               </w:rPr>
             </w:pPr>
             <w:r>
               <w:rPr>
-                <w:rFonts w:ascii="標楷體" w:eastAsia="標楷體" w:hAnsi="標楷體" w:cs="標楷體"/>
+                <w:rFonts w:ascii="Times New Roman" w:eastAsia="教育部標準楷書" w:hAnsi="Times New Roman" w:cs="教育部標準楷書"/>
                 <w:sz w:val="24"/>
                 <w:szCs w:val="24"/>
               </w:rPr>
@@ -3141,14 +3141,14 @@
               <w:spacing w:lineRule="auto" w:line="276"/>
               <w:jc w:val="both"/>
               <w:rPr>
-                <w:rFonts w:ascii="標楷體" w:eastAsia="標楷體" w:hAnsi="標楷體" w:cs="標楷體"/>
+                <w:rFonts w:ascii="Times New Roman" w:eastAsia="教育部標準楷書" w:hAnsi="Times New Roman" w:cs="教育部標準楷書"/>
                 <w:sz w:val="24"/>
                 <w:szCs w:val="24"/>
               </w:rPr>
             </w:pPr>
             <w:r>
               <w:rPr>
-                <w:rFonts w:ascii="標楷體" w:eastAsia="標楷體" w:hAnsi="標楷體" w:cs="標楷體"/>
+                <w:rFonts w:ascii="Times New Roman" w:eastAsia="教育部標準楷書" w:hAnsi="Times New Roman" w:cs="教育部標準楷書"/>
                 <w:sz w:val="24"/>
                 <w:szCs w:val="24"/>
               </w:rPr>
@@ -3178,14 +3178,14 @@
               <w:spacing w:lineRule="auto" w:line="276"/>
               <w:jc w:val="both"/>
               <w:rPr>
-                <w:rFonts w:ascii="標楷體" w:eastAsia="標楷體" w:hAnsi="標楷體" w:cs="標楷體"/>
+                <w:rFonts w:ascii="Times New Roman" w:eastAsia="教育部標準楷書" w:hAnsi="Times New Roman" w:cs="教育部標準楷書"/>
                 <w:sz w:val="24"/>
                 <w:szCs w:val="24"/>
               </w:rPr>
             </w:pPr>
             <w:r>
               <w:rPr>
-                <w:rFonts w:ascii="標楷體" w:eastAsia="標楷體" w:hAnsi="標楷體" w:cs="標楷體"/>
+                <w:rFonts w:ascii="Times New Roman" w:eastAsia="教育部標準楷書" w:hAnsi="Times New Roman" w:cs="教育部標準楷書"/>
                 <w:sz w:val="24"/>
                 <w:szCs w:val="24"/>
               </w:rPr>
@@ -3215,14 +3215,14 @@
               <w:spacing w:lineRule="auto" w:line="276"/>
               <w:jc w:val="both"/>
               <w:rPr>
-                <w:rFonts w:ascii="標楷體" w:eastAsia="標楷體" w:hAnsi="標楷體" w:cs="標楷體"/>
+                <w:rFonts w:ascii="Times New Roman" w:eastAsia="教育部標準楷書" w:hAnsi="Times New Roman" w:cs="教育部標準楷書"/>
                 <w:sz w:val="24"/>
                 <w:szCs w:val="24"/>
               </w:rPr>
             </w:pPr>
             <w:r>
               <w:rPr>
-                <w:rFonts w:ascii="標楷體" w:eastAsia="標楷體" w:hAnsi="標楷體" w:cs="標楷體"/>
+                <w:rFonts w:ascii="Times New Roman" w:eastAsia="教育部標準楷書" w:hAnsi="Times New Roman" w:cs="教育部標準楷書"/>
                 <w:sz w:val="24"/>
                 <w:szCs w:val="24"/>
               </w:rPr>
@@ -3259,14 +3259,14 @@
               <w:spacing w:lineRule="auto" w:line="276"/>
               <w:jc w:val="both"/>
               <w:rPr>
-                <w:rFonts w:ascii="標楷體" w:eastAsia="標楷體" w:hAnsi="標楷體" w:cs="標楷體"/>
+                <w:rFonts w:ascii="Times New Roman" w:eastAsia="教育部標準楷書" w:hAnsi="Times New Roman" w:cs="教育部標準楷書"/>
                 <w:sz w:val="24"/>
                 <w:szCs w:val="24"/>
               </w:rPr>
             </w:pPr>
             <w:r>
               <w:rPr>
-                <w:rFonts w:ascii="標楷體" w:eastAsia="標楷體" w:hAnsi="標楷體" w:cs="標楷體"/>
+                <w:rFonts w:ascii="Times New Roman" w:eastAsia="教育部標準楷書" w:hAnsi="Times New Roman" w:cs="教育部標準楷書"/>
                 <w:sz w:val="24"/>
                 <w:szCs w:val="24"/>
               </w:rPr>
@@ -3296,7 +3296,7 @@
               <w:spacing w:lineRule="auto" w:line="276"/>
               <w:jc w:val="both"/>
               <w:rPr>
-                <w:rFonts w:ascii="標楷體" w:eastAsia="標楷體" w:hAnsi="標楷體" w:cs="標楷體"/>
+                <w:rFonts w:ascii="Times New Roman" w:eastAsia="教育部標準楷書" w:hAnsi="Times New Roman" w:cs="教育部標準楷書"/>
                 <w:sz w:val="24"/>
                 <w:szCs w:val="24"/>
               </w:rPr>
@@ -3325,7 +3325,7 @@
               <w:spacing w:lineRule="auto" w:line="276"/>
               <w:jc w:val="both"/>
               <w:rPr>
-                <w:rFonts w:ascii="標楷體" w:eastAsia="標楷體" w:hAnsi="標楷體" w:cs="標楷體"/>
+                <w:rFonts w:ascii="Times New Roman" w:eastAsia="教育部標準楷書" w:hAnsi="Times New Roman" w:cs="教育部標準楷書"/>
                 <w:sz w:val="24"/>
                 <w:szCs w:val="24"/>
               </w:rPr>
@@ -3354,7 +3354,7 @@
               <w:spacing w:lineRule="auto" w:line="276"/>
               <w:jc w:val="both"/>
               <w:rPr>
-                <w:rFonts w:ascii="標楷體" w:eastAsia="標楷體" w:hAnsi="標楷體" w:cs="標楷體"/>
+                <w:rFonts w:ascii="Times New Roman" w:eastAsia="教育部標準楷書" w:hAnsi="Times New Roman" w:cs="教育部標準楷書"/>
                 <w:sz w:val="24"/>
                 <w:szCs w:val="24"/>
               </w:rPr>
@@ -3383,7 +3383,7 @@
               <w:spacing w:lineRule="auto" w:line="276"/>
               <w:jc w:val="both"/>
               <w:rPr>
-                <w:rFonts w:ascii="標楷體" w:eastAsia="標楷體" w:hAnsi="標楷體" w:cs="標楷體"/>
+                <w:rFonts w:ascii="Times New Roman" w:eastAsia="教育部標準楷書" w:hAnsi="Times New Roman" w:cs="教育部標準楷書"/>
                 <w:sz w:val="24"/>
                 <w:szCs w:val="24"/>
               </w:rPr>
@@ -3412,7 +3412,7 @@
               <w:spacing w:lineRule="auto" w:line="276"/>
               <w:jc w:val="both"/>
               <w:rPr>
-                <w:rFonts w:ascii="標楷體" w:eastAsia="標楷體" w:hAnsi="標楷體" w:cs="標楷體"/>
+                <w:rFonts w:ascii="Times New Roman" w:eastAsia="教育部標準楷書" w:hAnsi="Times New Roman" w:cs="教育部標準楷書"/>
                 <w:sz w:val="24"/>
                 <w:szCs w:val="24"/>
               </w:rPr>
@@ -3448,14 +3448,14 @@
               <w:spacing w:lineRule="auto" w:line="276"/>
               <w:jc w:val="both"/>
               <w:rPr>
-                <w:rFonts w:ascii="標楷體" w:eastAsia="標楷體" w:hAnsi="標楷體" w:cs="標楷體"/>
+                <w:rFonts w:ascii="Times New Roman" w:eastAsia="教育部標準楷書" w:hAnsi="Times New Roman" w:cs="教育部標準楷書"/>
                 <w:sz w:val="24"/>
                 <w:szCs w:val="24"/>
               </w:rPr>
             </w:pPr>
             <w:r>
               <w:rPr>
-                <w:rFonts w:ascii="標楷體" w:eastAsia="標楷體" w:hAnsi="標楷體" w:cs="標楷體"/>
+                <w:rFonts w:ascii="Times New Roman" w:eastAsia="教育部標準楷書" w:hAnsi="Times New Roman" w:cs="教育部標準楷書"/>
                 <w:sz w:val="24"/>
                 <w:szCs w:val="24"/>
               </w:rPr>
@@ -3485,7 +3485,7 @@
               <w:spacing w:lineRule="auto" w:line="276"/>
               <w:jc w:val="both"/>
               <w:rPr>
-                <w:rFonts w:ascii="標楷體" w:eastAsia="標楷體" w:hAnsi="標楷體" w:cs="標楷體"/>
+                <w:rFonts w:ascii="Times New Roman" w:eastAsia="教育部標準楷書" w:hAnsi="Times New Roman" w:cs="教育部標準楷書"/>
                 <w:sz w:val="24"/>
                 <w:szCs w:val="24"/>
               </w:rPr>
@@ -3514,7 +3514,7 @@
               <w:spacing w:lineRule="auto" w:line="276"/>
               <w:jc w:val="both"/>
               <w:rPr>
-                <w:rFonts w:ascii="標楷體" w:eastAsia="標楷體" w:hAnsi="標楷體" w:cs="標楷體"/>
+                <w:rFonts w:ascii="Times New Roman" w:eastAsia="教育部標準楷書" w:hAnsi="Times New Roman" w:cs="教育部標準楷書"/>
                 <w:sz w:val="24"/>
                 <w:szCs w:val="24"/>
               </w:rPr>
@@ -3543,7 +3543,7 @@
               <w:spacing w:lineRule="auto" w:line="276"/>
               <w:jc w:val="both"/>
               <w:rPr>
-                <w:rFonts w:ascii="標楷體" w:eastAsia="標楷體" w:hAnsi="標楷體" w:cs="標楷體"/>
+                <w:rFonts w:ascii="Times New Roman" w:eastAsia="教育部標準楷書" w:hAnsi="Times New Roman" w:cs="教育部標準楷書"/>
                 <w:sz w:val="24"/>
                 <w:szCs w:val="24"/>
               </w:rPr>
@@ -3572,7 +3572,7 @@
               <w:spacing w:lineRule="auto" w:line="276"/>
               <w:jc w:val="both"/>
               <w:rPr>
-                <w:rFonts w:ascii="標楷體" w:eastAsia="標楷體" w:hAnsi="標楷體" w:cs="標楷體"/>
+                <w:rFonts w:ascii="Times New Roman" w:eastAsia="教育部標準楷書" w:hAnsi="Times New Roman" w:cs="教育部標準楷書"/>
                 <w:sz w:val="24"/>
                 <w:szCs w:val="24"/>
               </w:rPr>
@@ -3601,7 +3601,7 @@
               <w:spacing w:lineRule="auto" w:line="276"/>
               <w:jc w:val="both"/>
               <w:rPr>
-                <w:rFonts w:ascii="標楷體" w:eastAsia="標楷體" w:hAnsi="標楷體" w:cs="標楷體"/>
+                <w:rFonts w:ascii="Times New Roman" w:eastAsia="教育部標準楷書" w:hAnsi="Times New Roman" w:cs="教育部標準楷書"/>
                 <w:sz w:val="24"/>
                 <w:szCs w:val="24"/>
               </w:rPr>
@@ -3616,7 +3616,7 @@
         <w:ind w:left="425" w:hanging="425"/>
         <w:jc w:val="both"/>
         <w:rPr>
-          <w:rFonts w:ascii="標楷體" w:eastAsia="標楷體" w:hAnsi="標楷體" w:cs="標楷體"/>
+          <w:rFonts w:ascii="Times New Roman" w:eastAsia="教育部標準楷書" w:hAnsi="Times New Roman" w:cs="教育部標準楷書"/>
           <w:sz w:val="24"/>
           <w:szCs w:val="24"/>
         </w:rPr>
@@ -3628,14 +3628,14 @@
         <w:ind w:left="425" w:hanging="425"/>
         <w:jc w:val="both"/>
         <w:rPr>
-          <w:rFonts w:ascii="標楷體" w:eastAsia="標楷體" w:hAnsi="標楷體" w:cs="標楷體"/>
-          <w:sz w:val="24"/>
-          <w:szCs w:val="24"/>
-        </w:rPr>
-      </w:pPr>
-      <w:r>
-        <w:rPr>
-          <w:rFonts w:ascii="標楷體" w:eastAsia="標楷體" w:hAnsi="標楷體" w:cs="標楷體"/>
+          <w:rFonts w:ascii="Times New Roman" w:eastAsia="教育部標準楷書" w:hAnsi="Times New Roman" w:cs="教育部標準楷書"/>
+          <w:sz w:val="24"/>
+          <w:szCs w:val="24"/>
+        </w:rPr>
+      </w:pPr>
+      <w:r>
+        <w:rPr>
+          <w:rFonts w:ascii="Times New Roman" w:eastAsia="教育部標準楷書" w:hAnsi="Times New Roman" w:cs="教育部標準楷書"/>
           <w:b/>
           <w:bCs/>
           <w:sz w:val="24"/>
@@ -3646,7 +3646,7 @@
       <w:proofErr w:type="gramStart"/>
       <w:r>
         <w:rPr>
-          <w:rFonts w:ascii="標楷體" w:eastAsia="標楷體" w:hAnsi="標楷體" w:cs="標楷體"/>
+          <w:rFonts w:ascii="Times New Roman" w:eastAsia="教育部標準楷書" w:hAnsi="Times New Roman" w:cs="教育部標準楷書"/>
           <w:b/>
           <w:bCs/>
           <w:sz w:val="24"/>
@@ -3657,7 +3657,7 @@
       <w:proofErr w:type="gramEnd"/>
       <w:r>
         <w:rPr>
-          <w:rFonts w:ascii="標楷體" w:eastAsia="標楷體" w:hAnsi="標楷體" w:cs="標楷體"/>
+          <w:rFonts w:ascii="Times New Roman" w:eastAsia="教育部標準楷書" w:hAnsi="Times New Roman" w:cs="教育部標準楷書"/>
           <w:b/>
           <w:bCs/>
           <w:sz w:val="24"/>
@@ -3667,7 +3667,7 @@
       </w:r>
       <w:r>
         <w:rPr>
-          <w:rFonts w:ascii="標楷體" w:eastAsia="標楷體" w:hAnsi="標楷體" w:cs="標楷體"/>
+          <w:rFonts w:ascii="Times New Roman" w:eastAsia="教育部標準楷書" w:hAnsi="Times New Roman" w:cs="教育部標準楷書"/>
           <w:sz w:val="24"/>
           <w:szCs w:val="24"/>
         </w:rPr>
@@ -3676,7 +3676,7 @@
       <w:proofErr w:type="gramStart"/>
       <w:r>
         <w:rPr>
-          <w:rFonts w:ascii="標楷體" w:eastAsia="標楷體" w:hAnsi="標楷體" w:cs="標楷體"/>
+          <w:rFonts w:ascii="Times New Roman" w:eastAsia="教育部標準楷書" w:hAnsi="Times New Roman" w:cs="教育部標準楷書"/>
           <w:sz w:val="24"/>
           <w:szCs w:val="24"/>
         </w:rPr>
@@ -3685,7 +3685,7 @@
       <w:proofErr w:type="gramEnd"/>
       <w:r>
         <w:rPr>
-          <w:rFonts w:ascii="標楷體" w:eastAsia="標楷體" w:hAnsi="標楷體" w:cs="標楷體"/>
+          <w:rFonts w:ascii="Times New Roman" w:eastAsia="教育部標準楷書" w:hAnsi="Times New Roman" w:cs="教育部標準楷書"/>
           <w:sz w:val="24"/>
           <w:szCs w:val="24"/>
         </w:rPr>
@@ -3694,7 +3694,7 @@
       <w:proofErr w:type="gramStart"/>
       <w:r>
         <w:rPr>
-          <w:rFonts w:ascii="標楷體" w:eastAsia="標楷體" w:hAnsi="標楷體" w:cs="標楷體"/>
+          <w:rFonts w:ascii="Times New Roman" w:eastAsia="教育部標準楷書" w:hAnsi="Times New Roman" w:cs="教育部標準楷書"/>
           <w:sz w:val="24"/>
           <w:szCs w:val="24"/>
         </w:rPr>
@@ -3712,7 +3712,7 @@
       </w:r>
       <w:r>
         <w:rPr>
-          <w:rFonts w:ascii="標楷體" w:eastAsia="標楷體" w:hAnsi="標楷體" w:cs="標楷體"/>
+          <w:rFonts w:ascii="Times New Roman" w:eastAsia="教育部標準楷書" w:hAnsi="Times New Roman" w:cs="教育部標準楷書"/>
           <w:color w:val="1155CC"/>
           <w:sz w:val="24"/>
           <w:szCs w:val="24"/>
@@ -3726,7 +3726,7 @@
       <w:proofErr w:type="gramStart"/>
       <w:r>
         <w:rPr>
-          <w:rFonts w:ascii="標楷體" w:eastAsia="標楷體" w:hAnsi="標楷體" w:cs="標楷體"/>
+          <w:rFonts w:ascii="Times New Roman" w:eastAsia="教育部標準楷書" w:hAnsi="Times New Roman" w:cs="教育部標準楷書"/>
           <w:sz w:val="24"/>
           <w:szCs w:val="24"/>
         </w:rPr>
@@ -3735,7 +3735,7 @@
       <w:proofErr w:type="gramEnd"/>
       <w:r>
         <w:rPr>
-          <w:rFonts w:ascii="標楷體" w:eastAsia="標楷體" w:hAnsi="標楷體" w:cs="標楷體"/>
+          <w:rFonts w:ascii="Times New Roman" w:eastAsia="教育部標準楷書" w:hAnsi="Times New Roman" w:cs="教育部標準楷書"/>
           <w:sz w:val="24"/>
           <w:szCs w:val="24"/>
         </w:rPr>
@@ -3743,7 +3743,7 @@
       </w:r>
       <w:r>
         <w:rPr>
-          <w:rFonts w:ascii="標楷體" w:eastAsia="標楷體" w:hAnsi="標楷體" w:cs="標楷體"/>
+          <w:rFonts w:ascii="Times New Roman" w:eastAsia="教育部標準楷書" w:hAnsi="Times New Roman" w:cs="教育部標準楷書"/>
           <w:sz w:val="24"/>
           <w:szCs w:val="24"/>
           <w:shd w:val="clear" w:color="auto" w:fill="FFF2CC"/>
@@ -3752,7 +3752,7 @@
       </w:r>
       <w:r>
         <w:rPr>
-          <w:rFonts w:ascii="標楷體" w:eastAsia="標楷體" w:hAnsi="標楷體" w:cs="標楷體"/>
+          <w:rFonts w:ascii="Times New Roman" w:eastAsia="教育部標準楷書" w:hAnsi="Times New Roman" w:cs="教育部標準楷書"/>
           <w:sz w:val="24"/>
           <w:szCs w:val="24"/>
         </w:rPr>
@@ -3765,7 +3765,7 @@
         <w:ind w:left="425" w:hanging="425"/>
         <w:jc w:val="both"/>
         <w:rPr>
-          <w:rFonts w:ascii="標楷體" w:eastAsia="標楷體" w:hAnsi="標楷體" w:cs="標楷體"/>
+          <w:rFonts w:ascii="Times New Roman" w:eastAsia="教育部標準楷書" w:hAnsi="Times New Roman" w:cs="教育部標準楷書"/>
           <w:sz w:val="24"/>
           <w:szCs w:val="24"/>
         </w:rPr>
@@ -3777,14 +3777,14 @@
         <w:ind w:left="425" w:hanging="425"/>
         <w:jc w:val="both"/>
         <w:rPr>
-          <w:rFonts w:ascii="標楷體" w:eastAsia="標楷體" w:hAnsi="標楷體" w:cs="標楷體"/>
-          <w:sz w:val="24"/>
-          <w:szCs w:val="24"/>
-        </w:rPr>
-      </w:pPr>
-      <w:r>
-        <w:rPr>
-          <w:rFonts w:ascii="標楷體" w:eastAsia="標楷體" w:hAnsi="標楷體" w:cs="標楷體"/>
+          <w:rFonts w:ascii="Times New Roman" w:eastAsia="教育部標準楷書" w:hAnsi="Times New Roman" w:cs="教育部標準楷書"/>
+          <w:sz w:val="24"/>
+          <w:szCs w:val="24"/>
+        </w:rPr>
+      </w:pPr>
+      <w:r>
+        <w:rPr>
+          <w:rFonts w:ascii="Times New Roman" w:eastAsia="教育部標準楷書" w:hAnsi="Times New Roman" w:cs="教育部標準楷書"/>
           <w:b/>
           <w:bCs/>
           <w:sz w:val="24"/>
@@ -3795,7 +3795,7 @@
       <w:proofErr w:type="gramStart"/>
       <w:r>
         <w:rPr>
-          <w:rFonts w:ascii="標楷體" w:eastAsia="標楷體" w:hAnsi="標楷體" w:cs="標楷體"/>
+          <w:rFonts w:ascii="Times New Roman" w:eastAsia="教育部標準楷書" w:hAnsi="Times New Roman" w:cs="教育部標準楷書"/>
           <w:b/>
           <w:bCs/>
           <w:sz w:val="24"/>
@@ -3806,7 +3806,7 @@
       <w:proofErr w:type="gramEnd"/>
       <w:r>
         <w:rPr>
-          <w:rFonts w:ascii="標楷體" w:eastAsia="標楷體" w:hAnsi="標楷體" w:cs="標楷體"/>
+          <w:rFonts w:ascii="Times New Roman" w:eastAsia="教育部標準楷書" w:hAnsi="Times New Roman" w:cs="教育部標準楷書"/>
           <w:b/>
           <w:bCs/>
           <w:sz w:val="24"/>
@@ -3816,7 +3816,7 @@
       </w:r>
       <w:r>
         <w:rPr>
-          <w:rFonts w:ascii="標楷體" w:eastAsia="標楷體" w:hAnsi="標楷體" w:cs="標楷體"/>
+          <w:rFonts w:ascii="Times New Roman" w:eastAsia="教育部標準楷書" w:hAnsi="Times New Roman" w:cs="教育部標準楷書"/>
           <w:sz w:val="24"/>
           <w:szCs w:val="24"/>
         </w:rPr>
@@ -3825,7 +3825,7 @@
       <w:proofErr w:type="gramStart"/>
       <w:r>
         <w:rPr>
-          <w:rFonts w:ascii="標楷體" w:eastAsia="標楷體" w:hAnsi="標楷體" w:cs="標楷體"/>
+          <w:rFonts w:ascii="Times New Roman" w:eastAsia="教育部標準楷書" w:hAnsi="Times New Roman" w:cs="教育部標準楷書"/>
           <w:sz w:val="24"/>
           <w:szCs w:val="24"/>
         </w:rPr>
@@ -3834,7 +3834,7 @@
       <w:proofErr w:type="gramEnd"/>
       <w:r>
         <w:rPr>
-          <w:rFonts w:ascii="標楷體" w:eastAsia="標楷體" w:hAnsi="標楷體" w:cs="標楷體"/>
+          <w:rFonts w:ascii="Times New Roman" w:eastAsia="教育部標準楷書" w:hAnsi="Times New Roman" w:cs="教育部標準楷書"/>
           <w:sz w:val="24"/>
           <w:szCs w:val="24"/>
         </w:rPr>
@@ -3843,7 +3843,7 @@
       <w:proofErr w:type="gramStart"/>
       <w:r>
         <w:rPr>
-          <w:rFonts w:ascii="標楷體" w:eastAsia="標楷體" w:hAnsi="標楷體" w:cs="標楷體"/>
+          <w:rFonts w:ascii="Times New Roman" w:eastAsia="教育部標準楷書" w:hAnsi="Times New Roman" w:cs="教育部標準楷書"/>
           <w:sz w:val="24"/>
           <w:szCs w:val="24"/>
         </w:rPr>
@@ -3852,7 +3852,7 @@
       <w:proofErr w:type="gramEnd"/>
       <w:r>
         <w:rPr>
-          <w:rFonts w:ascii="標楷體" w:eastAsia="標楷體" w:hAnsi="標楷體" w:cs="標楷體"/>
+          <w:rFonts w:ascii="Times New Roman" w:eastAsia="教育部標準楷書" w:hAnsi="Times New Roman" w:cs="教育部標準楷書"/>
           <w:sz w:val="24"/>
           <w:szCs w:val="24"/>
         </w:rPr>
@@ -4170,7 +4170,7 @@
   <w:docDefaults>
     <w:rPrDefault>
       <w:rPr>
-        <w:rFonts w:ascii="Arial" w:eastAsiaTheme="minorEastAsia" w:hAnsi="Arial" w:cs="Arial"/>
+        <w:rFonts w:ascii="Times New Roman" w:eastAsiaTheme="minorEastAsia" w:hAnsi="Times New Roman" w:cs="教育部標準楷書" w:eastAsia="教育部標準楷書"/>
         <w:sz w:val="22"/>
         <w:szCs w:val="22"/>
         <w:lang w:val="zh-TW" w:eastAsia="zh-TW" w:bidi="ar-SA"/>

</xml_diff>